<commit_message>
Refactor ranking experience and refresh criterion data
</commit_message>
<xml_diff>
--- a/tmp/pdfs/Eco-cultural/Eco-cultural Restoration and Indigenous Sovereignty_ The Story Behind the Criterion.docx
+++ b/tmp/pdfs/Eco-cultural/Eco-cultural Restoration and Indigenous Sovereignty_ The Story Behind the Criterion.docx
@@ -241,7 +241,7 @@
     </w:p>
     <w:sdt>
       <w:sdtPr>
-        <w:id w:val="1036047416"/>
+        <w:id w:val="-213980630"/>
         <w:docPartObj>
           <w:docPartGallery w:val="Table of Contents"/>
           <w:docPartUnique w:val="1"/>
@@ -2060,7 +2060,7 @@
         </w:rPr>
         <w:t xml:space="preserve">The Just Transitions in the Delta team seeks to evaluate how different salinity management strategies may facilitate eco-cultural restoration and Indigenous sovereignty. Building upon existing eco-cultural restoration work in the Delta, this project utilizes the Delta Island Adaptations definition for eco-cultural restoration (</w:t>
       </w:r>
-      <w:hyperlink r:id="rId8">
+      <w:hyperlink r:id="rId12">
         <w:r>
           <w:rPr>
             <w:color w:val="1155cc"/>
@@ -2147,7 +2147,7 @@
       </w:r>
       <w:commentRangeStart w:id="0"/>
       <w:commentRangeStart w:id="1"/>
-      <w:hyperlink r:id="rId9">
+      <w:hyperlink r:id="rId13">
         <w:r>
           <w:rPr>
             <w:color w:val="1155cc"/>
@@ -2681,7 +2681,7 @@
                     <pic:cNvPicPr preferRelativeResize="0"/>
                   </pic:nvPicPr>
                   <pic:blipFill>
-                    <a:blip r:embed="rId10"/>
+                    <a:blip r:embed="rId14"/>
                     <a:srcRect b="0" l="3088" r="0" t="0"/>
                     <a:stretch>
                       <a:fillRect/>
@@ -2909,13 +2909,36 @@
         <w:pStyle w:val="Heading1"/>
         <w:rPr/>
       </w:pPr>
-      <w:bookmarkStart w:colFirst="0" w:colLast="0" w:name="_gd9mot9dygch" w:id="8"/>
+      <w:bookmarkStart w:colFirst="0" w:colLast="0" w:name="_ewwqs01tmrak" w:id="8"/>
       <w:bookmarkEnd w:id="8"/>
       <w:r>
         <w:rPr>
           <w:rtl w:val="0"/>
         </w:rPr>
+      </w:r>
+    </w:p>
+    <w:p>
+      <w:pPr>
+        <w:pStyle w:val="Heading1"/>
+        <w:rPr/>
+      </w:pPr>
+      <w:bookmarkStart w:colFirst="0" w:colLast="0" w:name="_gd9mot9dygch" w:id="9"/>
+      <w:bookmarkEnd w:id="9"/>
+      <w:commentRangeStart w:id="4"/>
+      <w:r>
+        <w:rPr>
+          <w:rtl w:val="0"/>
+        </w:rPr>
         <w:t xml:space="preserve">What are the components of this criterion?</w:t>
+      </w:r>
+      <w:commentRangeEnd w:id="4"/>
+      <w:r>
+        <w:commentReference w:id="4"/>
+      </w:r>
+      <w:r>
+        <w:rPr>
+          <w:rtl w:val="0"/>
+        </w:rPr>
       </w:r>
     </w:p>
     <w:p>
@@ -2942,8 +2965,8 @@
           <w:szCs w:val="28"/>
         </w:rPr>
       </w:pPr>
-      <w:bookmarkStart w:colFirst="0" w:colLast="0" w:name="_tinx7igc8z3u" w:id="9"/>
-      <w:bookmarkEnd w:id="9"/>
+      <w:bookmarkStart w:colFirst="0" w:colLast="0" w:name="_tinx7igc8z3u" w:id="10"/>
+      <w:bookmarkEnd w:id="10"/>
       <w:r>
         <w:rPr>
           <w:sz w:val="28"/>
@@ -2993,8 +3016,8 @@
           <w:szCs w:val="28"/>
         </w:rPr>
       </w:pPr>
-      <w:bookmarkStart w:colFirst="0" w:colLast="0" w:name="_l8600tftha6a" w:id="10"/>
-      <w:bookmarkEnd w:id="10"/>
+      <w:bookmarkStart w:colFirst="0" w:colLast="0" w:name="_l8600tftha6a" w:id="11"/>
+      <w:bookmarkEnd w:id="11"/>
       <w:r>
         <w:rPr>
           <w:sz w:val="28"/>
@@ -3030,8 +3053,8 @@
           <w:szCs w:val="28"/>
         </w:rPr>
       </w:pPr>
-      <w:bookmarkStart w:colFirst="0" w:colLast="0" w:name="_7v9jri3lx7qh" w:id="11"/>
-      <w:bookmarkEnd w:id="11"/>
+      <w:bookmarkStart w:colFirst="0" w:colLast="0" w:name="_7v9jri3lx7qh" w:id="12"/>
+      <w:bookmarkEnd w:id="12"/>
       <w:r>
         <w:rPr>
           <w:sz w:val="28"/>
@@ -3091,8 +3114,8 @@
           <w:szCs w:val="28"/>
         </w:rPr>
       </w:pPr>
-      <w:bookmarkStart w:colFirst="0" w:colLast="0" w:name="_jbjcytj9mbgt" w:id="12"/>
-      <w:bookmarkEnd w:id="12"/>
+      <w:bookmarkStart w:colFirst="0" w:colLast="0" w:name="_jbjcytj9mbgt" w:id="13"/>
+      <w:bookmarkEnd w:id="13"/>
       <w:r>
         <w:rPr>
           <w:sz w:val="28"/>
@@ -3120,8 +3143,8 @@
         <w:t xml:space="preserve">Advancing the inherent right of Indigenous peoples to govern themselves, their lands, and resources, and to maintain their cultures and Traditional ways of life. </w:t>
       </w:r>
       <w:del w:author="Ashley N. DePew" w:id="0" w:date="2026-09-15T05:20:46Z">
-        <w:commentRangeStart w:id="4"/>
         <w:commentRangeStart w:id="5"/>
+        <w:commentRangeStart w:id="6"/>
         <w:r>
           <w:rPr>
             <w:sz w:val="24"/>
@@ -3131,13 +3154,13 @@
           <w:delText xml:space="preserve">This metric will assess the degree to which the scenarios can restore stolen land and grant resource rights.</w:delText>
         </w:r>
       </w:del>
-      <w:commentRangeEnd w:id="4"/>
-      <w:r>
-        <w:commentReference w:id="4"/>
-      </w:r>
       <w:commentRangeEnd w:id="5"/>
       <w:r>
         <w:commentReference w:id="5"/>
+      </w:r>
+      <w:commentRangeEnd w:id="6"/>
+      <w:r>
+        <w:commentReference w:id="6"/>
       </w:r>
       <w:r>
         <w:rPr>
@@ -3150,8 +3173,8 @@
         <w:pStyle w:val="Heading1"/>
         <w:rPr/>
       </w:pPr>
-      <w:bookmarkStart w:colFirst="0" w:colLast="0" w:name="_jz2m2ynqqrw3" w:id="13"/>
-      <w:bookmarkEnd w:id="13"/>
+      <w:bookmarkStart w:colFirst="0" w:colLast="0" w:name="_jz2m2ynqqrw3" w:id="14"/>
+      <w:bookmarkEnd w:id="14"/>
       <w:r>
         <w:rPr>
           <w:rtl w:val="0"/>
@@ -3164,8 +3187,8 @@
         <w:pStyle w:val="Heading2"/>
         <w:rPr/>
       </w:pPr>
-      <w:bookmarkStart w:colFirst="0" w:colLast="0" w:name="_o3p46svhlv1x" w:id="14"/>
-      <w:bookmarkEnd w:id="14"/>
+      <w:bookmarkStart w:colFirst="0" w:colLast="0" w:name="_o3p46svhlv1x" w:id="15"/>
+      <w:bookmarkEnd w:id="15"/>
       <w:r>
         <w:rPr>
           <w:rtl w:val="0"/>
@@ -3188,7 +3211,7 @@
         </w:rPr>
         <w:t xml:space="preserve">This metric is assessed throughout the Delta watershed. Specifically, the New Green Watershed includes in-Delta restoration in combination with restoration in the upper watershed. Eco Machine includes restoration limited to in-Delta. Restoration techniques applied in these scenarios include</w:t>
       </w:r>
-      <w:commentRangeStart w:id="6"/>
+      <w:commentRangeStart w:id="7"/>
       <w:r>
         <w:rPr>
           <w:sz w:val="24"/>
@@ -3197,9 +3220,9 @@
         </w:rPr>
         <w:t xml:space="preserve"> varying habitat types</w:t>
       </w:r>
-      <w:commentRangeEnd w:id="6"/>
-      <w:r>
-        <w:commentReference w:id="6"/>
+      <w:commentRangeEnd w:id="7"/>
+      <w:r>
+        <w:commentReference w:id="7"/>
       </w:r>
       <w:r>
         <w:rPr>
@@ -3215,8 +3238,8 @@
         <w:pStyle w:val="Heading2"/>
         <w:rPr/>
       </w:pPr>
-      <w:bookmarkStart w:colFirst="0" w:colLast="0" w:name="_dxiwxj0dfec" w:id="15"/>
-      <w:bookmarkEnd w:id="15"/>
+      <w:bookmarkStart w:colFirst="0" w:colLast="0" w:name="_dxiwxj0dfec" w:id="16"/>
+      <w:bookmarkEnd w:id="16"/>
       <w:r>
         <w:rPr>
           <w:rtl w:val="0"/>
@@ -3638,8 +3661,8 @@
           <w:szCs w:val="24"/>
         </w:rPr>
       </w:pPr>
-      <w:commentRangeStart w:id="7"/>
       <w:commentRangeStart w:id="8"/>
+      <w:commentRangeStart w:id="9"/>
       <w:r>
         <w:rPr>
           <w:sz w:val="24"/>
@@ -3648,13 +3671,13 @@
         </w:rPr>
         <w:t xml:space="preserve">Need to combine habitat restoration with flow </w:t>
       </w:r>
-      <w:commentRangeEnd w:id="7"/>
-      <w:r>
-        <w:commentReference w:id="7"/>
-      </w:r>
       <w:commentRangeEnd w:id="8"/>
       <w:r>
         <w:commentReference w:id="8"/>
+      </w:r>
+      <w:commentRangeEnd w:id="9"/>
+      <w:r>
+        <w:commentReference w:id="9"/>
       </w:r>
       <w:r>
         <w:rPr>
@@ -3757,8 +3780,8 @@
           <w:u w:val="none"/>
         </w:rPr>
       </w:pPr>
-      <w:commentRangeStart w:id="9"/>
       <w:commentRangeStart w:id="10"/>
+      <w:commentRangeStart w:id="11"/>
       <w:r>
         <w:rPr>
           <w:rtl w:val="0"/>
@@ -3783,13 +3806,13 @@
         </w:rPr>
         <w:t xml:space="preserve">Upper watershed restored area: NGW Upland Restoration Scenario Matrix</w:t>
       </w:r>
-      <w:commentRangeEnd w:id="9"/>
-      <w:r>
-        <w:commentReference w:id="9"/>
-      </w:r>
       <w:commentRangeEnd w:id="10"/>
       <w:r>
         <w:commentReference w:id="10"/>
+      </w:r>
+      <w:commentRangeEnd w:id="11"/>
+      <w:r>
+        <w:commentReference w:id="11"/>
       </w:r>
       <w:r>
         <w:rPr>
@@ -5305,8 +5328,8 @@
         </w:rPr>
       </w:pPr>
       <w:ins w:author="Maggie Gallagher" w:id="1" w:date="2026-09-16T22:42:12Z">
-        <w:commentRangeStart w:id="11"/>
         <w:commentRangeStart w:id="12"/>
+        <w:commentRangeStart w:id="13"/>
         <w:r>
           <w:rPr>
             <w:rFonts w:ascii="Arial" w:cs="Arial" w:eastAsia="Arial" w:hAnsi="Arial"/>
@@ -5325,13 +5348,13 @@
           </w:rPr>
           <w:t xml:space="preserve">Table 1: Upland Restoration</w:t>
         </w:r>
-        <w:commentRangeEnd w:id="11"/>
-        <w:r>
-          <w:commentReference w:id="11"/>
-        </w:r>
         <w:commentRangeEnd w:id="12"/>
         <w:r>
           <w:commentReference w:id="12"/>
+        </w:r>
+        <w:commentRangeEnd w:id="13"/>
+        <w:r>
+          <w:commentReference w:id="13"/>
         </w:r>
         <w:r>
           <w:rPr>
@@ -7956,8 +7979,8 @@
         <w:pStyle w:val="Heading2"/>
         <w:rPr/>
       </w:pPr>
-      <w:bookmarkStart w:colFirst="0" w:colLast="0" w:name="_l6o0jnx1j8x6" w:id="16"/>
-      <w:bookmarkEnd w:id="16"/>
+      <w:bookmarkStart w:colFirst="0" w:colLast="0" w:name="_l6o0jnx1j8x6" w:id="17"/>
+      <w:bookmarkEnd w:id="17"/>
       <w:r>
         <w:rPr>
           <w:rtl w:val="0"/>
@@ -8371,11 +8394,11 @@
               </w:rPr>
               <w:t xml:space="preserve">Wet soil ag</w:t>
             </w:r>
-            <w:commentRangeStart w:id="13"/>
             <w:commentRangeStart w:id="14"/>
             <w:commentRangeStart w:id="15"/>
             <w:commentRangeStart w:id="16"/>
             <w:commentRangeStart w:id="17"/>
+            <w:commentRangeStart w:id="18"/>
             <w:r>
               <w:rPr>
                 <w:rFonts w:ascii="Arial" w:cs="Arial" w:eastAsia="Arial" w:hAnsi="Arial"/>
@@ -8384,10 +8407,6 @@
                 <w:rtl w:val="0"/>
               </w:rPr>
               <w:t xml:space="preserve">…?</w:t>
-            </w:r>
-            <w:commentRangeEnd w:id="13"/>
-            <w:r>
-              <w:commentReference w:id="13"/>
             </w:r>
             <w:commentRangeEnd w:id="14"/>
             <w:r>
@@ -8404,6 +8423,10 @@
             <w:commentRangeEnd w:id="17"/>
             <w:r>
               <w:commentReference w:id="17"/>
+            </w:r>
+            <w:commentRangeEnd w:id="18"/>
+            <w:r>
+              <w:commentReference w:id="18"/>
             </w:r>
             <w:r>
               <w:rPr>
@@ -11875,8 +11898,8 @@
         <w:pStyle w:val="Heading1"/>
         <w:rPr/>
       </w:pPr>
-      <w:bookmarkStart w:colFirst="0" w:colLast="0" w:name="_zgzk1j342qfp" w:id="17"/>
-      <w:bookmarkEnd w:id="17"/>
+      <w:bookmarkStart w:colFirst="0" w:colLast="0" w:name="_zgzk1j342qfp" w:id="18"/>
+      <w:bookmarkEnd w:id="18"/>
       <w:r>
         <w:rPr>
           <w:rtl w:val="0"/>
@@ -11889,8 +11912,8 @@
         <w:pStyle w:val="Heading2"/>
         <w:rPr/>
       </w:pPr>
-      <w:bookmarkStart w:colFirst="0" w:colLast="0" w:name="_za3iiuwvuaee" w:id="18"/>
-      <w:bookmarkEnd w:id="18"/>
+      <w:bookmarkStart w:colFirst="0" w:colLast="0" w:name="_za3iiuwvuaee" w:id="19"/>
+      <w:bookmarkEnd w:id="19"/>
       <w:r>
         <w:rPr>
           <w:rtl w:val="0"/>
@@ -11941,7 +11964,7 @@
         </w:rPr>
         <w:t xml:space="preserve"> that increased access to land will happen in the</w:t>
       </w:r>
-      <w:commentRangeStart w:id="18"/>
+      <w:commentRangeStart w:id="19"/>
       <w:r>
         <w:rPr>
           <w:sz w:val="24"/>
@@ -11950,9 +11973,9 @@
         </w:rPr>
         <w:t xml:space="preserve"> Eco Machine and New Green Watershed </w:t>
       </w:r>
-      <w:commentRangeEnd w:id="18"/>
-      <w:r>
-        <w:commentReference w:id="18"/>
+      <w:commentRangeEnd w:id="19"/>
+      <w:r>
+        <w:commentReference w:id="19"/>
       </w:r>
       <w:r>
         <w:rPr>
@@ -11962,7 +11985,7 @@
         </w:rPr>
         <w:t xml:space="preserve">scenarios, </w:t>
       </w:r>
-      <w:commentRangeStart w:id="19"/>
+      <w:commentRangeStart w:id="20"/>
       <w:r>
         <w:rPr>
           <w:sz w:val="24"/>
@@ -11977,9 +12000,9 @@
         </w:rPr>
         <w:t xml:space="preserve">orated in these narratives</w:t>
       </w:r>
-      <w:commentRangeEnd w:id="19"/>
-      <w:r>
-        <w:commentReference w:id="19"/>
+      <w:commentRangeEnd w:id="20"/>
+      <w:r>
+        <w:commentReference w:id="20"/>
       </w:r>
       <w:r>
         <w:rPr>
@@ -12012,8 +12035,8 @@
         <w:pStyle w:val="Heading2"/>
         <w:rPr/>
       </w:pPr>
-      <w:bookmarkStart w:colFirst="0" w:colLast="0" w:name="_euy60il91qxk" w:id="19"/>
-      <w:bookmarkEnd w:id="19"/>
+      <w:bookmarkStart w:colFirst="0" w:colLast="0" w:name="_euy60il91qxk" w:id="20"/>
+      <w:bookmarkEnd w:id="20"/>
       <w:r>
         <w:rPr>
           <w:rtl w:val="0"/>
@@ -12334,8 +12357,8 @@
           <w:szCs w:val="24"/>
         </w:rPr>
       </w:pPr>
-      <w:bookmarkStart w:colFirst="0" w:colLast="0" w:name="_zcqx4qv6m2lr" w:id="20"/>
-      <w:bookmarkEnd w:id="20"/>
+      <w:bookmarkStart w:colFirst="0" w:colLast="0" w:name="_zcqx4qv6m2lr" w:id="21"/>
+      <w:bookmarkEnd w:id="21"/>
       <w:r>
         <w:rPr>
           <w:rtl w:val="0"/>
@@ -12353,8 +12376,8 @@
         <w:pStyle w:val="Heading3"/>
         <w:rPr/>
       </w:pPr>
-      <w:bookmarkStart w:colFirst="0" w:colLast="0" w:name="_oz5dthx3dcs1" w:id="21"/>
-      <w:bookmarkEnd w:id="21"/>
+      <w:bookmarkStart w:colFirst="0" w:colLast="0" w:name="_oz5dthx3dcs1" w:id="22"/>
+      <w:bookmarkEnd w:id="22"/>
       <w:r>
         <w:rPr>
           <w:rtl w:val="0"/>
@@ -12372,8 +12395,8 @@
         <w:pStyle w:val="Heading4"/>
         <w:rPr/>
       </w:pPr>
-      <w:bookmarkStart w:colFirst="0" w:colLast="0" w:name="_455coycejaa0" w:id="22"/>
-      <w:bookmarkEnd w:id="22"/>
+      <w:bookmarkStart w:colFirst="0" w:colLast="0" w:name="_455coycejaa0" w:id="23"/>
+      <w:bookmarkEnd w:id="23"/>
       <w:r>
         <w:rPr>
           <w:b w:val="1"/>
@@ -12411,8 +12434,8 @@
         <w:pStyle w:val="Heading4"/>
         <w:rPr/>
       </w:pPr>
-      <w:bookmarkStart w:colFirst="0" w:colLast="0" w:name="_cnhu6jsfzmim" w:id="23"/>
-      <w:bookmarkEnd w:id="23"/>
+      <w:bookmarkStart w:colFirst="0" w:colLast="0" w:name="_cnhu6jsfzmim" w:id="24"/>
+      <w:bookmarkEnd w:id="24"/>
       <w:r>
         <w:rPr>
           <w:rtl w:val="0"/>
@@ -12468,8 +12491,8 @@
         <w:pStyle w:val="Heading4"/>
         <w:rPr/>
       </w:pPr>
-      <w:bookmarkStart w:colFirst="0" w:colLast="0" w:name="_kyqwzkxobax7" w:id="24"/>
-      <w:bookmarkEnd w:id="24"/>
+      <w:bookmarkStart w:colFirst="0" w:colLast="0" w:name="_kyqwzkxobax7" w:id="25"/>
+      <w:bookmarkEnd w:id="25"/>
       <w:r>
         <w:rPr>
           <w:rtl w:val="0"/>
@@ -12493,8 +12516,8 @@
         <w:pStyle w:val="Heading4"/>
         <w:rPr/>
       </w:pPr>
-      <w:bookmarkStart w:colFirst="0" w:colLast="0" w:name="_clae4krhidaq" w:id="25"/>
-      <w:bookmarkEnd w:id="25"/>
+      <w:bookmarkStart w:colFirst="0" w:colLast="0" w:name="_clae4krhidaq" w:id="26"/>
+      <w:bookmarkEnd w:id="26"/>
       <w:r>
         <w:rPr>
           <w:rtl w:val="0"/>
@@ -12512,16 +12535,16 @@
         </w:rPr>
         <w:t xml:space="preserve">CCEs are a type of CE that explicitly recognizes and protects Tribal cultural practices. These agreements emphasize that land can be used for traditional ceremonial use and traditional medicinal gathering (Middleton, 2011). The CCE can include language that explicitly ensures that Tribes have physical access to the land during specific times (Middleton, 2011). </w:t>
       </w:r>
-      <w:commentRangeStart w:id="20"/>
+      <w:commentRangeStart w:id="21"/>
       <w:r>
         <w:rPr>
           <w:rtl w:val="0"/>
         </w:rPr>
         <w:t xml:space="preserve">In Oakland, Sogorea Te’ Land Trust has obtained a cultural conservation easement on five acres of city-owned land (Sogorea Te’ Land Trust, n.d.). The organization writes, “The City of Oakland will retain underlying ownership of the property but is granting a cultural conservation easement to the Land Trust in perpetuity. The easement is technically a “conservation easement” under state law” ( n.d.).  It is unclear if CCE’s are legally possible in California or if organizations choose to call them cultural conservation easements in order to emphasize the cultural importance of land with regard to traditional ceremonial use and medicine gathering. </w:t>
       </w:r>
-      <w:commentRangeEnd w:id="20"/>
-      <w:r>
-        <w:commentReference w:id="20"/>
+      <w:commentRangeEnd w:id="21"/>
+      <w:r>
+        <w:commentReference w:id="21"/>
       </w:r>
       <w:r>
         <w:rPr>
@@ -12534,8 +12557,8 @@
         <w:pStyle w:val="Heading4"/>
         <w:rPr/>
       </w:pPr>
-      <w:bookmarkStart w:colFirst="0" w:colLast="0" w:name="_lp8newbmwotn" w:id="26"/>
-      <w:bookmarkEnd w:id="26"/>
+      <w:bookmarkStart w:colFirst="0" w:colLast="0" w:name="_lp8newbmwotn" w:id="27"/>
+      <w:bookmarkEnd w:id="27"/>
       <w:r>
         <w:rPr>
           <w:rtl w:val="0"/>
@@ -12631,8 +12654,8 @@
         <w:pStyle w:val="Heading2"/>
         <w:rPr/>
       </w:pPr>
-      <w:bookmarkStart w:colFirst="0" w:colLast="0" w:name="_tqs4u1au85yn" w:id="27"/>
-      <w:bookmarkEnd w:id="27"/>
+      <w:bookmarkStart w:colFirst="0" w:colLast="0" w:name="_tqs4u1au85yn" w:id="28"/>
+      <w:bookmarkEnd w:id="28"/>
       <w:r>
         <w:rPr>
           <w:rtl w:val="0"/>
@@ -12692,8 +12715,8 @@
         <w:pStyle w:val="Heading2"/>
         <w:rPr/>
       </w:pPr>
-      <w:bookmarkStart w:colFirst="0" w:colLast="0" w:name="_uhsnvf8scazh" w:id="28"/>
-      <w:bookmarkEnd w:id="28"/>
+      <w:bookmarkStart w:colFirst="0" w:colLast="0" w:name="_uhsnvf8scazh" w:id="29"/>
+      <w:bookmarkEnd w:id="29"/>
       <w:r>
         <w:rPr>
           <w:rtl w:val="0"/>
@@ -12833,8 +12856,8 @@
           <w:szCs w:val="24"/>
         </w:rPr>
       </w:pPr>
-      <w:bookmarkStart w:colFirst="0" w:colLast="0" w:name="_5bv4jd2l9wrm" w:id="29"/>
-      <w:bookmarkEnd w:id="29"/>
+      <w:bookmarkStart w:colFirst="0" w:colLast="0" w:name="_5bv4jd2l9wrm" w:id="30"/>
+      <w:bookmarkEnd w:id="30"/>
       <w:r>
         <w:rPr>
           <w:rtl w:val="0"/>
@@ -12964,7 +12987,7 @@
         </w:rPr>
         <w:t xml:space="preserve"> (CNRA, 2026). Furthermore, CNRA has published a </w:t>
       </w:r>
-      <w:hyperlink r:id="rId11">
+      <w:hyperlink r:id="rId15">
         <w:r>
           <w:rPr>
             <w:color w:val="1155cc"/>
@@ -13138,8 +13161,8 @@
         <w:pStyle w:val="Heading1"/>
         <w:rPr/>
       </w:pPr>
-      <w:bookmarkStart w:colFirst="0" w:colLast="0" w:name="_m7844l7nb0y6" w:id="30"/>
-      <w:bookmarkEnd w:id="30"/>
+      <w:bookmarkStart w:colFirst="0" w:colLast="0" w:name="_m7844l7nb0y6" w:id="31"/>
+      <w:bookmarkEnd w:id="31"/>
       <w:r>
         <w:rPr>
           <w:sz w:val="48"/>
@@ -13159,8 +13182,8 @@
         <w:pStyle w:val="Heading2"/>
         <w:rPr/>
       </w:pPr>
-      <w:bookmarkStart w:colFirst="0" w:colLast="0" w:name="_32s7zqno39ww" w:id="31"/>
-      <w:bookmarkEnd w:id="31"/>
+      <w:bookmarkStart w:colFirst="0" w:colLast="0" w:name="_32s7zqno39ww" w:id="32"/>
+      <w:bookmarkEnd w:id="32"/>
       <w:r>
         <w:rPr>
           <w:rtl w:val="0"/>
@@ -13217,8 +13240,8 @@
         <w:pStyle w:val="Heading2"/>
         <w:rPr/>
       </w:pPr>
-      <w:bookmarkStart w:colFirst="0" w:colLast="0" w:name="_1qxx3s76ralu" w:id="32"/>
-      <w:bookmarkEnd w:id="32"/>
+      <w:bookmarkStart w:colFirst="0" w:colLast="0" w:name="_1qxx3s76ralu" w:id="33"/>
+      <w:bookmarkEnd w:id="33"/>
       <w:r>
         <w:rPr>
           <w:rtl w:val="0"/>
@@ -13305,8 +13328,8 @@
         <w:pStyle w:val="Heading1"/>
         <w:rPr/>
       </w:pPr>
-      <w:bookmarkStart w:colFirst="0" w:colLast="0" w:name="_yabo9sjeuf0r" w:id="33"/>
-      <w:bookmarkEnd w:id="33"/>
+      <w:bookmarkStart w:colFirst="0" w:colLast="0" w:name="_yabo9sjeuf0r" w:id="34"/>
+      <w:bookmarkEnd w:id="34"/>
       <w:r>
         <w:rPr>
           <w:rtl w:val="0"/>
@@ -13663,10 +13686,10 @@
           <w:szCs w:val="24"/>
         </w:rPr>
       </w:pPr>
-      <w:commentRangeStart w:id="21"/>
       <w:commentRangeStart w:id="22"/>
       <w:commentRangeStart w:id="23"/>
-      <w:hyperlink r:id="rId12">
+      <w:commentRangeStart w:id="24"/>
+      <w:hyperlink r:id="rId16">
         <w:r>
           <w:rPr>
             <w:color w:val="1155cc"/>
@@ -13699,7 +13722,7 @@
           <w:szCs w:val="24"/>
         </w:rPr>
       </w:pPr>
-      <w:hyperlink r:id="rId13">
+      <w:hyperlink r:id="rId17">
         <w:r>
           <w:rPr>
             <w:color w:val="1155cc"/>
@@ -13732,7 +13755,7 @@
           <w:szCs w:val="24"/>
         </w:rPr>
       </w:pPr>
-      <w:hyperlink r:id="rId14">
+      <w:hyperlink r:id="rId18">
         <w:r>
           <w:rPr>
             <w:color w:val="1155cc"/>
@@ -13765,7 +13788,7 @@
           <w:szCs w:val="24"/>
         </w:rPr>
       </w:pPr>
-      <w:hyperlink r:id="rId15">
+      <w:hyperlink r:id="rId19">
         <w:r>
           <w:rPr>
             <w:color w:val="1155cc"/>
@@ -13785,10 +13808,6 @@
         </w:rPr>
         <w:t xml:space="preserve"> High School. Broad Tribal Focus </w:t>
       </w:r>
-      <w:commentRangeEnd w:id="21"/>
-      <w:r>
-        <w:commentReference w:id="21"/>
-      </w:r>
       <w:commentRangeEnd w:id="22"/>
       <w:r>
         <w:commentReference w:id="22"/>
@@ -13796,6 +13815,10 @@
       <w:commentRangeEnd w:id="23"/>
       <w:r>
         <w:commentReference w:id="23"/>
+      </w:r>
+      <w:commentRangeEnd w:id="24"/>
+      <w:r>
+        <w:commentReference w:id="24"/>
       </w:r>
       <w:r>
         <w:rPr>
@@ -14174,8 +14197,8 @@
         <w:pStyle w:val="Heading1"/>
         <w:rPr/>
       </w:pPr>
-      <w:bookmarkStart w:colFirst="0" w:colLast="0" w:name="_sap026urp6q9" w:id="34"/>
-      <w:bookmarkEnd w:id="34"/>
+      <w:bookmarkStart w:colFirst="0" w:colLast="0" w:name="_sap026urp6q9" w:id="35"/>
+      <w:bookmarkEnd w:id="35"/>
       <w:r>
         <w:rPr>
           <w:rtl w:val="0"/>
@@ -14203,23 +14226,23 @@
           </w:rPr>
           <w:delText xml:space="preserve">The scenarios that ranked the best for this metric are New Green Watershed</w:delText>
         </w:r>
-        <w:commentRangeStart w:id="24"/>
+        <w:commentRangeStart w:id="25"/>
         <w:r>
           <w:rPr>
             <w:rtl w:val="0"/>
           </w:rPr>
           <w:delText xml:space="preserve"> (4) and Eco Machine (1).</w:delText>
         </w:r>
-        <w:commentRangeStart w:id="25"/>
+        <w:commentRangeStart w:id="26"/>
         <w:r>
           <w:rPr>
             <w:rtl w:val="0"/>
           </w:rPr>
           <w:delText xml:space="preserve"> T</w:delText>
         </w:r>
-        <w:commentRangeEnd w:id="24"/>
+        <w:commentRangeEnd w:id="25"/>
         <w:r>
-          <w:commentReference w:id="24"/>
+          <w:commentReference w:id="25"/>
         </w:r>
         <w:r>
           <w:rPr>
@@ -14289,9 +14312,9 @@
           </w:rPr>
           <w:delText xml:space="preserve">Lastly, A Tunnel ranked at -2. This is because of the drastic change in the physical geography, water use, and, most importantly, flows that the tunnel would have across the Bay-Delta watershed. </w:delText>
         </w:r>
-        <w:commentRangeEnd w:id="25"/>
+        <w:commentRangeEnd w:id="26"/>
         <w:r>
-          <w:commentReference w:id="25"/>
+          <w:commentReference w:id="26"/>
         </w:r>
         <w:r>
           <w:rPr>
@@ -15381,7 +15404,7 @@
               </w:rPr>
             </w:pPr>
             <w:ins w:author="Ashley N. DePew" w:id="3" w:date="2026-09-21T21:58:55Z">
-              <w:commentRangeStart w:id="26"/>
+              <w:commentRangeStart w:id="27"/>
               <w:r>
                 <w:rPr>
                   <w:rFonts w:ascii="Arial" w:cs="Arial" w:eastAsia="Arial" w:hAnsi="Arial"/>
@@ -15453,9 +15476,9 @@
         </w:rPr>
       </w:pPr>
       <w:ins w:author="Ashley N. DePew" w:id="3" w:date="2026-09-21T21:58:55Z">
-        <w:commentRangeEnd w:id="26"/>
+        <w:commentRangeEnd w:id="27"/>
         <w:r>
-          <w:commentReference w:id="26"/>
+          <w:commentReference w:id="27"/>
         </w:r>
         <w:r>
           <w:rPr>
@@ -15473,8 +15496,8 @@
         </w:rPr>
       </w:pPr>
       <w:ins w:author="Ashley N. DePew" w:id="3" w:date="2026-09-21T21:58:55Z">
-        <w:bookmarkStart w:colFirst="0" w:colLast="0" w:name="_75ay0zjoibke" w:id="35"/>
-        <w:bookmarkEnd w:id="35"/>
+        <w:bookmarkStart w:colFirst="0" w:colLast="0" w:name="_75ay0zjoibke" w:id="36"/>
+        <w:bookmarkEnd w:id="36"/>
         <w:r>
           <w:rPr>
             <w:rtl w:val="0"/>
@@ -15587,8 +15610,8 @@
         </w:rPr>
       </w:pPr>
       <w:ins w:author="Ashley N. DePew" w:id="5" w:date="2026-09-21T22:15:27Z">
-        <w:bookmarkStart w:colFirst="0" w:colLast="0" w:name="_w4ck1dbxut98" w:id="36"/>
-        <w:bookmarkEnd w:id="36"/>
+        <w:bookmarkStart w:colFirst="0" w:colLast="0" w:name="_w4ck1dbxut98" w:id="37"/>
+        <w:bookmarkEnd w:id="37"/>
         <w:r>
           <w:rPr>
             <w:rtl w:val="0"/>
@@ -18540,18 +18563,18 @@
         <w:pStyle w:val="Heading1"/>
         <w:rPr/>
       </w:pPr>
-      <w:bookmarkStart w:colFirst="0" w:colLast="0" w:name="_tofxvj8s6jzf" w:id="37"/>
-      <w:bookmarkEnd w:id="37"/>
-      <w:commentRangeStart w:id="27"/>
+      <w:bookmarkStart w:colFirst="0" w:colLast="0" w:name="_tofxvj8s6jzf" w:id="38"/>
+      <w:bookmarkEnd w:id="38"/>
+      <w:commentRangeStart w:id="28"/>
       <w:r>
         <w:rPr>
           <w:rtl w:val="0"/>
         </w:rPr>
         <w:t xml:space="preserve">Implications and Discussion</w:t>
       </w:r>
-      <w:commentRangeEnd w:id="27"/>
-      <w:r>
-        <w:commentReference w:id="27"/>
+      <w:commentRangeEnd w:id="28"/>
+      <w:r>
+        <w:commentReference w:id="28"/>
       </w:r>
       <w:r>
         <w:rPr>
@@ -18692,8 +18715,8 @@
         </w:rPr>
       </w:pPr>
       <w:ins w:author="Ashley N. DePew" w:id="7" w:date="2026-09-17T23:35:13Z">
-        <w:bookmarkStart w:colFirst="0" w:colLast="0" w:name="_x8h9qts9ltk8" w:id="38"/>
-        <w:bookmarkEnd w:id="38"/>
+        <w:bookmarkStart w:colFirst="0" w:colLast="0" w:name="_x8h9qts9ltk8" w:id="39"/>
+        <w:bookmarkEnd w:id="39"/>
         <w:r>
           <w:rPr>
             <w:rtl w:val="0"/>
@@ -18832,8 +18855,8 @@
         </w:rPr>
       </w:pPr>
       <w:ins w:author="Ashley N. DePew" w:id="7" w:date="2026-09-17T23:35:13Z">
-        <w:bookmarkStart w:colFirst="0" w:colLast="0" w:name="_45g8dz1ygyrf" w:id="39"/>
-        <w:bookmarkEnd w:id="39"/>
+        <w:bookmarkStart w:colFirst="0" w:colLast="0" w:name="_45g8dz1ygyrf" w:id="40"/>
+        <w:bookmarkEnd w:id="40"/>
         <w:r>
           <w:rPr>
             <w:rtl w:val="0"/>
@@ -18880,8 +18903,8 @@
           </w:rPr>
           <w:t xml:space="preserve">All of the aforementioned types of agreements can be implemented across the Delta. While the Just Transitions in the Delta team has clear feedback on Indigenous community member preference for obtaining land access, the project team will not prescribe these elements across the Just Transitions scenarios. Therefore, while there is not a comparable score for this metric for each scenari</w:t>
         </w:r>
-        <w:commentRangeStart w:id="28"/>
         <w:commentRangeStart w:id="29"/>
+        <w:commentRangeStart w:id="30"/>
         <w:r>
           <w:rPr>
             <w:rtl w:val="0"/>
@@ -18926,13 +18949,13 @@
           </w:rPr>
           <w:t xml:space="preserve">.</w:t>
         </w:r>
-        <w:commentRangeEnd w:id="28"/>
-        <w:r>
-          <w:commentReference w:id="28"/>
-        </w:r>
         <w:commentRangeEnd w:id="29"/>
         <w:r>
           <w:commentReference w:id="29"/>
+        </w:r>
+        <w:commentRangeEnd w:id="30"/>
+        <w:r>
+          <w:commentReference w:id="30"/>
         </w:r>
         <w:r>
           <w:rPr>
@@ -19225,7 +19248,7 @@
         </w:rPr>
         <w:t xml:space="preserve">California Department of Water Resources (2017). Central Valley Flood Protection Plan Conservation Strategy - Appendix L: Measurable Objectives Development: Summary of Conservation Needs and Scale of Restoration Opportunities. </w:t>
       </w:r>
-      <w:hyperlink r:id="rId16">
+      <w:hyperlink r:id="rId20">
         <w:r>
           <w:rPr>
             <w:color w:val="1155cc"/>
@@ -19266,7 +19289,7 @@
         </w:rPr>
         <w:t xml:space="preserve">California Department of Water Resources. (2020). California EcoRestore Highlights 2015 to 2020. </w:t>
       </w:r>
-      <w:hyperlink r:id="rId17">
+      <w:hyperlink r:id="rId21">
         <w:r>
           <w:rPr>
             <w:color w:val="1155cc"/>
@@ -19312,7 +19335,7 @@
         </w:rPr>
         <w:t xml:space="preserve">Webb Tract Rice Conversion Project Lease Agreement.</w:t>
       </w:r>
-      <w:hyperlink r:id="rId18">
+      <w:hyperlink r:id="rId22">
         <w:r>
           <w:rPr>
             <w:color w:val="1155cc"/>
@@ -19406,7 +19429,7 @@
         </w:rPr>
         <w:t xml:space="preserve">Carroll, S. R., Garba, I., Figueroa-Rodríguez, O. L., Holbrook, J., Lovett, R., Materechera, S., Parsons, M., Raseroka, K., Rodriguez-Lonebear, D., Rowe, R., Sara, R., Walker, J. D., Anderson, J., &amp; Hudson, M. (2020). The CARE Principles for Indigenous Data Governance. Data Science Journal, 19, 43.</w:t>
       </w:r>
-      <w:hyperlink r:id="rId19">
+      <w:hyperlink r:id="rId23">
         <w:r>
           <w:rPr>
             <w:color w:val="1155cc"/>
@@ -19566,7 +19589,7 @@
         </w:rPr>
         <w:t xml:space="preserve">Dishgamu Humboldt Community Land Trust. N.d. </w:t>
       </w:r>
-      <w:hyperlink r:id="rId20">
+      <w:hyperlink r:id="rId24">
         <w:r>
           <w:rPr>
             <w:color w:val="1155cc"/>
@@ -19604,7 +19627,7 @@
         </w:rPr>
         <w:t xml:space="preserve">East Contra Costa County Natural Community Conservation Plan and Habitat Conservation Plan. 2003. Planning Agreement. </w:t>
       </w:r>
-      <w:hyperlink r:id="rId21">
+      <w:hyperlink r:id="rId25">
         <w:r>
           <w:rPr>
             <w:color w:val="1155cc"/>
@@ -19759,7 +19782,7 @@
         </w:rPr>
         <w:t xml:space="preserve">(3).</w:t>
       </w:r>
-      <w:hyperlink r:id="rId22">
+      <w:hyperlink r:id="rId26">
         <w:r>
           <w:rPr>
             <w:rtl w:val="0"/>
@@ -19767,7 +19790,7 @@
           <w:t xml:space="preserve"> </w:t>
         </w:r>
       </w:hyperlink>
-      <w:hyperlink r:id="rId23">
+      <w:hyperlink r:id="rId27">
         <w:r>
           <w:rPr>
             <w:color w:val="1155cc"/>
@@ -19804,7 +19827,7 @@
         </w:rPr>
         <w:t xml:space="preserve">Jennings, L., Anderson, T., Martinez, A., Sterling, R., Chavez, D. D., Garba, I., Hudson, M., Garrison, N. A., &amp; Carroll, S. R. (2023). Applying the ‘CARE Principles for Indigenous Data Governance’ to ecology and biodiversity research. Nature Ecology &amp; Evolution, 7(10), 1547–1551.</w:t>
       </w:r>
-      <w:hyperlink r:id="rId24">
+      <w:hyperlink r:id="rId28">
         <w:r>
           <w:rPr>
             <w:color w:val="1155cc"/>
@@ -19897,7 +19920,7 @@
         </w:rPr>
         <w:t xml:space="preserve">Maven’s Notebook. </w:t>
       </w:r>
-      <w:hyperlink r:id="rId25">
+      <w:hyperlink r:id="rId29">
         <w:r>
           <w:rPr>
             <w:color w:val="1155cc"/>
@@ -20067,7 +20090,7 @@
           <w:u w:val="single"/>
         </w:rPr>
       </w:pPr>
-      <w:hyperlink r:id="rId26">
+      <w:hyperlink r:id="rId30">
         <w:r>
           <w:rPr>
             <w:color w:val="a64d79"/>
@@ -20133,9 +20156,9 @@
       </w:r>
     </w:p>
     <w:sectPr>
-      <w:headerReference r:id="rId27" w:type="default"/>
-      <w:footerReference r:id="rId28" w:type="default"/>
-      <w:footerReference r:id="rId29" w:type="first"/>
+      <w:headerReference r:id="rId31" w:type="default"/>
+      <w:footerReference r:id="rId32" w:type="default"/>
+      <w:footerReference r:id="rId33" w:type="first"/>
       <w:pgSz w:h="15840" w:w="12240" w:orient="portrait"/>
       <w:pgMar w:bottom="1440" w:top="1440" w:left="1440" w:right="1440" w:header="720" w:footer="720"/>
       <w:pgNumType w:start="0"/>
@@ -20147,7 +20170,7 @@
 
 <file path=word/comments.xml><?xml version="1.0" encoding="utf-8"?>
 <w:comments xmlns:mc="http://schemas.openxmlformats.org/markup-compatibility/2006" xmlns:o="urn:schemas-microsoft-com:office:office" xmlns:r="http://schemas.openxmlformats.org/officeDocument/2006/relationships" xmlns:m="http://schemas.openxmlformats.org/officeDocument/2006/math" xmlns:v="urn:schemas-microsoft-com:vml" xmlns:wp="http://schemas.openxmlformats.org/drawingml/2006/wordprocessingDrawing" xmlns:w10="urn:schemas-microsoft-com:office:word" xmlns:w="http://schemas.openxmlformats.org/wordprocessingml/2006/main" xmlns:wne="http://schemas.microsoft.com/office/word/2006/wordml" xmlns:sl="http://schemas.openxmlformats.org/schemaLibrary/2006/main" xmlns:a="http://schemas.openxmlformats.org/drawingml/2006/main" xmlns:pic="http://schemas.openxmlformats.org/drawingml/2006/picture" xmlns:c="http://schemas.openxmlformats.org/drawingml/2006/chart" xmlns:lc="http://schemas.openxmlformats.org/drawingml/2006/lockedCanvas" xmlns:dgm="http://schemas.openxmlformats.org/drawingml/2006/diagram" xmlns:wps="http://schemas.microsoft.com/office/word/2010/wordprocessingShape" xmlns:wpg="http://schemas.microsoft.com/office/word/2010/wordprocessingGroup" xmlns:w14="http://schemas.microsoft.com/office/word/2010/wordml" xmlns:w15="http://schemas.microsoft.com/office/word/2012/wordml" xmlns:w16="http://schemas.microsoft.com/office/word/2018/wordml" xmlns:w16cex="http://schemas.microsoft.com/office/word/2018/wordml/cex" xmlns:w16cid="http://schemas.microsoft.com/office/word/2016/wordml/cid" xmlns="http://schemas.microsoft.com/office/tasks/2019/documenttasks" xmlns:cr="http://schemas.microsoft.com/office/comments/2020/reactions">
-  <w:comment w:author="Maggie Gallagher" w:id="13" w:date="2026-09-16T23:04:34Z">
+  <w:comment w:author="Maggie Gallagher" w:id="14" w:date="2026-09-16T23:04:34Z">
     <w:p>
       <w:pPr>
         <w:keepNext w:val="0"/>
@@ -20202,7 +20225,7 @@
       </w:r>
     </w:p>
   </w:comment>
-  <w:comment w:author="Ana Zepeda" w:id="14" w:date="2026-09-18T16:46:47Z">
+  <w:comment w:author="Ana Zepeda" w:id="15" w:date="2026-09-18T16:46:47Z">
     <w:p>
       <w:pPr>
         <w:keepNext w:val="0"/>
@@ -20237,6 +20260,15 @@
         </w:rPr>
       </w:pPr>
       <w:r>
+        <w:fldChar w:fldCharType="begin"/>
+        <w:instrText xml:space="preserve"> HYPERLINK "mailto:andepew@ucdavis.edu" </w:instrText>
+      </w:r>
+      <w:bookmarkStart w:colFirst="0" w:colLast="0" w:name="xfd1weqbbg0m" w:id="0"/>
+      <w:r>
+        <w:fldChar w:fldCharType="separate"/>
+      </w:r>
+      <w:bookmarkEnd w:id="0"/>
+      <w:r>
         <w:rPr>
           <w:rFonts w:ascii="Arial" w:cs="Arial" w:eastAsia="Arial" w:hAnsi="Arial"/>
           <w:b w:val="0"/>
@@ -20253,11 +20285,33 @@
           <w:vertAlign w:val="baseline"/>
           <w:rtl w:val="0"/>
         </w:rPr>
-        <w:t xml:space="preserve">@andepew@ucdavis.edu comment: I'd like to see the table breakdown upland forest, meadows, floodplains, wet soil ag (rice?), tidal wetlands, marshes(?) per scenario per region in the table. If more than FT and Suisun, please list.</w:t>
+        <w:t xml:space="preserve">@andepew@ucdavis.edu</w:t>
+      </w:r>
+      <w:r>
+        <w:fldChar w:fldCharType="end"/>
+      </w:r>
+      <w:r>
+        <w:rPr>
+          <w:rFonts w:ascii="Arial" w:cs="Arial" w:eastAsia="Arial" w:hAnsi="Arial"/>
+          <w:b w:val="0"/>
+          <w:bCs w:val="0"/>
+          <w:i w:val="0"/>
+          <w:iCs w:val="0"/>
+          <w:smallCaps w:val="0"/>
+          <w:strike w:val="0"/>
+          <w:color w:val="000000"/>
+          <w:sz w:val="22"/>
+          <w:szCs w:val="22"/>
+          <w:u w:val="none"/>
+          <w:shd w:fill="auto" w:val="clear"/>
+          <w:vertAlign w:val="baseline"/>
+          <w:rtl w:val="0"/>
+        </w:rPr>
+        <w:t xml:space="preserve"> comment: I'd like to see the table breakdown upland forest, meadows, floodplains, wet soil ag (rice?), tidal wetlands, marshes(?) per scenario per region in the table. If more than FT and Suisun, please list.</w:t>
       </w:r>
     </w:p>
   </w:comment>
-  <w:comment w:author="Ana Zepeda" w:id="15" w:date="2026-09-18T16:46:59Z">
+  <w:comment w:author="Ana Zepeda" w:id="16" w:date="2026-09-18T16:46:59Z">
     <w:p>
       <w:pPr>
         <w:keepNext w:val="0"/>
@@ -20312,7 +20366,7 @@
       </w:r>
     </w:p>
   </w:comment>
-  <w:comment w:author="Maggie Gallagher" w:id="16" w:date="2026-09-21T16:43:13Z">
+  <w:comment w:author="Maggie Gallagher" w:id="17" w:date="2026-09-21T16:43:13Z">
     <w:p>
       <w:pPr>
         <w:keepNext w:val="0"/>
@@ -20346,6 +20400,17 @@
           <w:vertAlign w:val="baseline"/>
         </w:rPr>
       </w:pPr>
+      <w:hyperlink r:id="rId1">
+        <w:r>
+          <w:rPr>
+            <w:color w:val="0000ee"/>
+            <w:u w:val="single"/>
+            <w:shd w:fill="auto" w:val="clear"/>
+            <w:rtl w:val="0"/>
+          </w:rPr>
+          <w:t xml:space="preserve">https://docs.google.com/spreadsheets/d/1gTsd-NAd9hf-2HHAQT68CdvrB_ageGtOSd4mwmsWvNg/edit?gid=2011468133#gid=2011468133</w:t>
+        </w:r>
+      </w:hyperlink>
       <w:r>
         <w:rPr>
           <w:rFonts w:ascii="Arial" w:cs="Arial" w:eastAsia="Arial" w:hAnsi="Arial"/>
@@ -20363,11 +20428,11 @@
           <w:vertAlign w:val="baseline"/>
           <w:rtl w:val="0"/>
         </w:rPr>
-        <w:t xml:space="preserve">https://docs.google.com/spreadsheets/d/1gTsd-NAd9hf-2HHAQT68CdvrB_ageGtOSd4mwmsWvNg/edit?gid=2011468133#gid=2011468133 Here are the in-delta land uses for NGW. There are 3 sub-scenarios, and the two habitat types being added are wet soil ag and managed wetlands. I added acreages into the tables</w:t>
+        <w:t xml:space="preserve"> Here are the in-delta land uses for NGW. There are 3 sub-scenarios, and the two habitat types being added are wet soil ag and managed wetlands. I added acreages into the tables</w:t>
       </w:r>
     </w:p>
   </w:comment>
-  <w:comment w:author="Maggie Gallagher" w:id="17" w:date="2026-09-21T16:43:59Z">
+  <w:comment w:author="Maggie Gallagher" w:id="18" w:date="2026-09-21T16:43:59Z">
     <w:p>
       <w:pPr>
         <w:keepNext w:val="0"/>
@@ -20401,6 +20466,17 @@
           <w:vertAlign w:val="baseline"/>
         </w:rPr>
       </w:pPr>
+      <w:hyperlink r:id="rId2">
+        <w:r>
+          <w:rPr>
+            <w:color w:val="0000ee"/>
+            <w:u w:val="single"/>
+            <w:shd w:fill="auto" w:val="clear"/>
+            <w:rtl w:val="0"/>
+          </w:rPr>
+          <w:t xml:space="preserve">https://app.mural.co/t/lda140greenbuilding9089/m/lda140greenbuilding9089/1760748054822/f532e952f59edf37e7be80d02c1087b452b00441</w:t>
+        </w:r>
+      </w:hyperlink>
       <w:r>
         <w:rPr>
           <w:rFonts w:ascii="Arial" w:cs="Arial" w:eastAsia="Arial" w:hAnsi="Arial"/>
@@ -20418,11 +20494,11 @@
           <w:vertAlign w:val="baseline"/>
           <w:rtl w:val="0"/>
         </w:rPr>
-        <w:t xml:space="preserve">https://app.mural.co/t/lda140greenbuilding9089/m/lda140greenbuilding9089/1760748054822/f532e952f59edf37e7be80d02c1087b452b00441 maps in miro board if thats helpful</w:t>
+        <w:t xml:space="preserve"> maps in miro board if thats helpful</w:t>
       </w:r>
     </w:p>
   </w:comment>
-  <w:comment w:author="Ashley N. DePew" w:id="7" w:date="2026-09-15T05:28:09Z">
+  <w:comment w:author="Brett Milligan" w:id="4" w:date="2026-10-22T00:03:18Z">
     <w:p>
       <w:pPr>
         <w:keepNext w:val="0"/>
@@ -20473,11 +20549,11 @@
           <w:vertAlign w:val="baseline"/>
           <w:rtl w:val="0"/>
         </w:rPr>
-        <w:t xml:space="preserve">@bmilligan@ucdavis.edu @amzepeda@ucdavis.edu outstanding?</w:t>
+        <w:t xml:space="preserve">I think we need a summary table here (same for all criteria), like we have in past versions and in presentations that lists out the metrics and their components/sub metrics and how they are measured.  This would make it easier to digest the following sections.</w:t>
       </w:r>
     </w:p>
   </w:comment>
-  <w:comment w:author="Ana Zepeda" w:id="8" w:date="2026-09-18T13:49:20Z">
+  <w:comment w:author="Ashley N. DePew" w:id="8" w:date="2026-09-15T05:28:09Z">
     <w:p>
       <w:pPr>
         <w:keepNext w:val="0"/>
@@ -20512,6 +20588,15 @@
         </w:rPr>
       </w:pPr>
       <w:r>
+        <w:fldChar w:fldCharType="begin"/>
+        <w:instrText xml:space="preserve"> HYPERLINK "mailto:bmilligan@ucdavis.edu" </w:instrText>
+      </w:r>
+      <w:bookmarkStart w:colFirst="0" w:colLast="0" w:name="2aw7gqkiqz5i" w:id="1"/>
+      <w:r>
+        <w:fldChar w:fldCharType="separate"/>
+      </w:r>
+      <w:bookmarkEnd w:id="1"/>
+      <w:r>
         <w:rPr>
           <w:rFonts w:ascii="Arial" w:cs="Arial" w:eastAsia="Arial" w:hAnsi="Arial"/>
           <w:b w:val="0"/>
@@ -20528,11 +20613,83 @@
           <w:vertAlign w:val="baseline"/>
           <w:rtl w:val="0"/>
         </w:rPr>
-        <w:t xml:space="preserve">tbh I forgot what this comment was in reference to, sorry.</w:t>
+        <w:t xml:space="preserve">@bmilligan@ucdavis.edu</w:t>
+      </w:r>
+      <w:r>
+        <w:fldChar w:fldCharType="end"/>
+      </w:r>
+      <w:r>
+        <w:rPr>
+          <w:rFonts w:ascii="Arial" w:cs="Arial" w:eastAsia="Arial" w:hAnsi="Arial"/>
+          <w:b w:val="0"/>
+          <w:bCs w:val="0"/>
+          <w:i w:val="0"/>
+          <w:iCs w:val="0"/>
+          <w:smallCaps w:val="0"/>
+          <w:strike w:val="0"/>
+          <w:color w:val="000000"/>
+          <w:sz w:val="22"/>
+          <w:szCs w:val="22"/>
+          <w:u w:val="none"/>
+          <w:shd w:fill="auto" w:val="clear"/>
+          <w:vertAlign w:val="baseline"/>
+          <w:rtl w:val="0"/>
+        </w:rPr>
+        <w:t xml:space="preserve"> </w:t>
+      </w:r>
+      <w:r>
+        <w:fldChar w:fldCharType="begin"/>
+        <w:instrText xml:space="preserve"> HYPERLINK "mailto:amzepeda@ucdavis.edu" </w:instrText>
+      </w:r>
+      <w:bookmarkStart w:colFirst="0" w:colLast="0" w:name="iyxej9an1ndv" w:id="2"/>
+      <w:r>
+        <w:fldChar w:fldCharType="separate"/>
+      </w:r>
+      <w:bookmarkEnd w:id="2"/>
+      <w:r>
+        <w:rPr>
+          <w:rFonts w:ascii="Arial" w:cs="Arial" w:eastAsia="Arial" w:hAnsi="Arial"/>
+          <w:b w:val="0"/>
+          <w:bCs w:val="0"/>
+          <w:i w:val="0"/>
+          <w:iCs w:val="0"/>
+          <w:smallCaps w:val="0"/>
+          <w:strike w:val="0"/>
+          <w:color w:val="000000"/>
+          <w:sz w:val="22"/>
+          <w:szCs w:val="22"/>
+          <w:u w:val="none"/>
+          <w:shd w:fill="auto" w:val="clear"/>
+          <w:vertAlign w:val="baseline"/>
+          <w:rtl w:val="0"/>
+        </w:rPr>
+        <w:t xml:space="preserve">@amzepeda@ucdavis.edu</w:t>
+      </w:r>
+      <w:r>
+        <w:fldChar w:fldCharType="end"/>
+      </w:r>
+      <w:r>
+        <w:rPr>
+          <w:rFonts w:ascii="Arial" w:cs="Arial" w:eastAsia="Arial" w:hAnsi="Arial"/>
+          <w:b w:val="0"/>
+          <w:bCs w:val="0"/>
+          <w:i w:val="0"/>
+          <w:iCs w:val="0"/>
+          <w:smallCaps w:val="0"/>
+          <w:strike w:val="0"/>
+          <w:color w:val="000000"/>
+          <w:sz w:val="22"/>
+          <w:szCs w:val="22"/>
+          <w:u w:val="none"/>
+          <w:shd w:fill="auto" w:val="clear"/>
+          <w:vertAlign w:val="baseline"/>
+          <w:rtl w:val="0"/>
+        </w:rPr>
+        <w:t xml:space="preserve"> outstanding?</w:t>
       </w:r>
     </w:p>
   </w:comment>
-  <w:comment w:author="Ashley N. DePew" w:id="6" w:date="2026-09-15T05:24:01Z">
+  <w:comment w:author="Ana Zepeda" w:id="9" w:date="2026-09-18T13:49:20Z">
     <w:p>
       <w:pPr>
         <w:keepNext w:val="0"/>
@@ -20583,11 +20740,11 @@
           <w:vertAlign w:val="baseline"/>
           <w:rtl w:val="0"/>
         </w:rPr>
-        <w:t xml:space="preserve">@bmilligan@ucdavis.edu @mfgallagher@ucdavis.edu can we accurately say this? I was under the impression we were doing wetland or wet soil ag. Can edit here to reflect that.</w:t>
+        <w:t xml:space="preserve">tbh I forgot what this comment was in reference to, sorry.</w:t>
       </w:r>
     </w:p>
   </w:comment>
-  <w:comment w:author="Ashley N. DePew" w:id="4" w:date="2026-09-15T05:21:04Z">
+  <w:comment w:author="Ashley N. DePew" w:id="7" w:date="2026-09-15T05:24:01Z">
     <w:p>
       <w:pPr>
         <w:keepNext w:val="0"/>
@@ -20622,6 +20779,15 @@
         </w:rPr>
       </w:pPr>
       <w:r>
+        <w:fldChar w:fldCharType="begin"/>
+        <w:instrText xml:space="preserve"> HYPERLINK "mailto:bmilligan@ucdavis.edu" </w:instrText>
+      </w:r>
+      <w:bookmarkStart w:colFirst="0" w:colLast="0" w:name="6qu51p9wbdfu" w:id="3"/>
+      <w:r>
+        <w:fldChar w:fldCharType="separate"/>
+      </w:r>
+      <w:bookmarkEnd w:id="3"/>
+      <w:r>
         <w:rPr>
           <w:rFonts w:ascii="Arial" w:cs="Arial" w:eastAsia="Arial" w:hAnsi="Arial"/>
           <w:b w:val="0"/>
@@ -20638,11 +20804,83 @@
           <w:vertAlign w:val="baseline"/>
           <w:rtl w:val="0"/>
         </w:rPr>
-        <w:t xml:space="preserve">deleting because I think this over-promises what we can deliver</w:t>
+        <w:t xml:space="preserve">@bmilligan@ucdavis.edu</w:t>
+      </w:r>
+      <w:r>
+        <w:fldChar w:fldCharType="end"/>
+      </w:r>
+      <w:r>
+        <w:rPr>
+          <w:rFonts w:ascii="Arial" w:cs="Arial" w:eastAsia="Arial" w:hAnsi="Arial"/>
+          <w:b w:val="0"/>
+          <w:bCs w:val="0"/>
+          <w:i w:val="0"/>
+          <w:iCs w:val="0"/>
+          <w:smallCaps w:val="0"/>
+          <w:strike w:val="0"/>
+          <w:color w:val="000000"/>
+          <w:sz w:val="22"/>
+          <w:szCs w:val="22"/>
+          <w:u w:val="none"/>
+          <w:shd w:fill="auto" w:val="clear"/>
+          <w:vertAlign w:val="baseline"/>
+          <w:rtl w:val="0"/>
+        </w:rPr>
+        <w:t xml:space="preserve"> </w:t>
+      </w:r>
+      <w:r>
+        <w:fldChar w:fldCharType="begin"/>
+        <w:instrText xml:space="preserve"> HYPERLINK "mailto:mfgallagher@ucdavis.edu" </w:instrText>
+      </w:r>
+      <w:bookmarkStart w:colFirst="0" w:colLast="0" w:name="wwrhgtq74cb1" w:id="4"/>
+      <w:r>
+        <w:fldChar w:fldCharType="separate"/>
+      </w:r>
+      <w:bookmarkEnd w:id="4"/>
+      <w:r>
+        <w:rPr>
+          <w:rFonts w:ascii="Arial" w:cs="Arial" w:eastAsia="Arial" w:hAnsi="Arial"/>
+          <w:b w:val="0"/>
+          <w:bCs w:val="0"/>
+          <w:i w:val="0"/>
+          <w:iCs w:val="0"/>
+          <w:smallCaps w:val="0"/>
+          <w:strike w:val="0"/>
+          <w:color w:val="000000"/>
+          <w:sz w:val="22"/>
+          <w:szCs w:val="22"/>
+          <w:u w:val="none"/>
+          <w:shd w:fill="auto" w:val="clear"/>
+          <w:vertAlign w:val="baseline"/>
+          <w:rtl w:val="0"/>
+        </w:rPr>
+        <w:t xml:space="preserve">@mfgallagher@ucdavis.edu</w:t>
+      </w:r>
+      <w:r>
+        <w:fldChar w:fldCharType="end"/>
+      </w:r>
+      <w:r>
+        <w:rPr>
+          <w:rFonts w:ascii="Arial" w:cs="Arial" w:eastAsia="Arial" w:hAnsi="Arial"/>
+          <w:b w:val="0"/>
+          <w:bCs w:val="0"/>
+          <w:i w:val="0"/>
+          <w:iCs w:val="0"/>
+          <w:smallCaps w:val="0"/>
+          <w:strike w:val="0"/>
+          <w:color w:val="000000"/>
+          <w:sz w:val="22"/>
+          <w:szCs w:val="22"/>
+          <w:u w:val="none"/>
+          <w:shd w:fill="auto" w:val="clear"/>
+          <w:vertAlign w:val="baseline"/>
+          <w:rtl w:val="0"/>
+        </w:rPr>
+        <w:t xml:space="preserve"> can we accurately say this? I was under the impression we were doing wetland or wet soil ag. Can edit here to reflect that.</w:t>
       </w:r>
     </w:p>
   </w:comment>
-  <w:comment w:author="Ana Zepeda" w:id="5" w:date="2026-09-18T16:38:02Z">
+  <w:comment w:author="Ashley N. DePew" w:id="5" w:date="2026-09-15T05:21:04Z">
     <w:p>
       <w:pPr>
         <w:keepNext w:val="0"/>
@@ -20693,11 +20931,11 @@
           <w:vertAlign w:val="baseline"/>
           <w:rtl w:val="0"/>
         </w:rPr>
-        <w:t xml:space="preserve">@bmilligan@ucdavis.edu I will let you have the final say. This  wording has been used since the beginning. If deleted here we should remove this from the metric moving forward.</w:t>
+        <w:t xml:space="preserve">deleting because I think this over-promises what we can deliver</w:t>
       </w:r>
     </w:p>
   </w:comment>
-  <w:comment w:author="Ana Zepeda" w:id="2" w:date="2026-09-15T22:43:04Z">
+  <w:comment w:author="Ana Zepeda" w:id="6" w:date="2026-09-18T16:38:02Z">
     <w:p>
       <w:pPr>
         <w:keepNext w:val="0"/>
@@ -20732,6 +20970,15 @@
         </w:rPr>
       </w:pPr>
       <w:r>
+        <w:fldChar w:fldCharType="begin"/>
+        <w:instrText xml:space="preserve"> HYPERLINK "mailto:bmilligan@ucdavis.edu" </w:instrText>
+      </w:r>
+      <w:bookmarkStart w:colFirst="0" w:colLast="0" w:name="827onwmgfmmv" w:id="5"/>
+      <w:r>
+        <w:fldChar w:fldCharType="separate"/>
+      </w:r>
+      <w:bookmarkEnd w:id="5"/>
+      <w:r>
         <w:rPr>
           <w:rFonts w:ascii="Arial" w:cs="Arial" w:eastAsia="Arial" w:hAnsi="Arial"/>
           <w:b w:val="0"/>
@@ -20748,11 +20995,33 @@
           <w:vertAlign w:val="baseline"/>
           <w:rtl w:val="0"/>
         </w:rPr>
-        <w:t xml:space="preserve">Is this the best terminology? In my understanding this only applies to federally recognized Tribes. Since there are many non-federally recognized Tribes in California that do not have as much 'rights'</w:t>
+        <w:t xml:space="preserve">@bmilligan@ucdavis.edu</w:t>
+      </w:r>
+      <w:r>
+        <w:fldChar w:fldCharType="end"/>
+      </w:r>
+      <w:r>
+        <w:rPr>
+          <w:rFonts w:ascii="Arial" w:cs="Arial" w:eastAsia="Arial" w:hAnsi="Arial"/>
+          <w:b w:val="0"/>
+          <w:bCs w:val="0"/>
+          <w:i w:val="0"/>
+          <w:iCs w:val="0"/>
+          <w:smallCaps w:val="0"/>
+          <w:strike w:val="0"/>
+          <w:color w:val="000000"/>
+          <w:sz w:val="22"/>
+          <w:szCs w:val="22"/>
+          <w:u w:val="none"/>
+          <w:shd w:fill="auto" w:val="clear"/>
+          <w:vertAlign w:val="baseline"/>
+          <w:rtl w:val="0"/>
+        </w:rPr>
+        <w:t xml:space="preserve"> I will let you have the final say. This  wording has been used since the beginning. If deleted here we should remove this from the metric moving forward.</w:t>
       </w:r>
     </w:p>
   </w:comment>
-  <w:comment w:author="Ashley N. DePew" w:id="21" w:date="2026-09-18T03:58:32Z">
+  <w:comment w:author="Ana Zepeda" w:id="2" w:date="2026-09-15T22:43:04Z">
     <w:p>
       <w:pPr>
         <w:keepNext w:val="0"/>
@@ -20803,11 +21072,11 @@
           <w:vertAlign w:val="baseline"/>
           <w:rtl w:val="0"/>
         </w:rPr>
-        <w:t xml:space="preserve">are these for Native or Non-native individuals?</w:t>
+        <w:t xml:space="preserve">Is this the best terminology? In my understanding this only applies to federally recognized Tribes. Since there are many non-federally recognized Tribes in California that do not have as much 'rights'</w:t>
       </w:r>
     </w:p>
   </w:comment>
-  <w:comment w:author="Ana Zepeda" w:id="22" w:date="2026-09-18T14:01:05Z">
+  <w:comment w:author="Ashley N. DePew" w:id="22" w:date="2026-09-18T03:58:32Z">
     <w:p>
       <w:pPr>
         <w:keepNext w:val="0"/>
@@ -20858,11 +21127,11 @@
           <w:vertAlign w:val="baseline"/>
           <w:rtl w:val="0"/>
         </w:rPr>
-        <w:t xml:space="preserve">I believe Redbud resource group is all Native people</w:t>
+        <w:t xml:space="preserve">are these for Native or Non-native individuals?</w:t>
       </w:r>
     </w:p>
   </w:comment>
-  <w:comment w:author="Ana Zepeda" w:id="23" w:date="2026-09-18T14:01:23Z">
+  <w:comment w:author="Ana Zepeda" w:id="23" w:date="2026-09-18T14:01:05Z">
     <w:p>
       <w:pPr>
         <w:keepNext w:val="0"/>
@@ -20913,11 +21182,11 @@
           <w:vertAlign w:val="baseline"/>
           <w:rtl w:val="0"/>
         </w:rPr>
-        <w:t xml:space="preserve">https://www.redbudresourcegroup.org/who-we-are</w:t>
+        <w:t xml:space="preserve">I believe Redbud resource group is all Native people</w:t>
       </w:r>
     </w:p>
   </w:comment>
-  <w:comment w:author="Ana Zepeda" w:id="9" w:date="2026-09-18T13:50:03Z">
+  <w:comment w:author="Ana Zepeda" w:id="24" w:date="2026-09-18T14:01:23Z">
     <w:p>
       <w:pPr>
         <w:keepNext w:val="0"/>
@@ -20951,26 +21220,20 @@
           <w:vertAlign w:val="baseline"/>
         </w:rPr>
       </w:pPr>
-      <w:r>
-        <w:rPr>
-          <w:rFonts w:ascii="Arial" w:cs="Arial" w:eastAsia="Arial" w:hAnsi="Arial"/>
-          <w:b w:val="0"/>
-          <w:bCs w:val="0"/>
-          <w:i w:val="0"/>
-          <w:iCs w:val="0"/>
-          <w:smallCaps w:val="0"/>
-          <w:strike w:val="0"/>
-          <w:color w:val="000000"/>
-          <w:sz w:val="22"/>
-          <w:szCs w:val="22"/>
-          <w:u w:val="none"/>
-          <w:shd w:fill="auto" w:val="clear"/>
-          <w:vertAlign w:val="baseline"/>
-          <w:rtl w:val="0"/>
-        </w:rPr>
-        <w:t xml:space="preserve">@mfgallagher@ucdavis.edu @bmilligan@ucdavis.edu  This does not include the tiered outflow, correct?</w:t>
-      </w:r>
-    </w:p>
+      <w:hyperlink r:id="rId3">
+        <w:r>
+          <w:rPr>
+            <w:color w:val="0000ee"/>
+            <w:u w:val="single"/>
+            <w:shd w:fill="auto" w:val="clear"/>
+            <w:rtl w:val="0"/>
+          </w:rPr>
+          <w:t xml:space="preserve">https://www.redbudresourcegroup.org/who-we-are</w:t>
+        </w:r>
+      </w:hyperlink>
+    </w:p>
+  </w:comment>
+  <w:comment w:author="Ana Zepeda" w:id="10" w:date="2026-09-18T13:50:03Z">
     <w:p>
       <w:pPr>
         <w:keepNext w:val="0"/>
@@ -21005,6 +21268,15 @@
         </w:rPr>
       </w:pPr>
       <w:r>
+        <w:fldChar w:fldCharType="begin"/>
+        <w:instrText xml:space="preserve"> HYPERLINK "mailto:mfgallagher@ucdavis.edu" </w:instrText>
+      </w:r>
+      <w:bookmarkStart w:colFirst="0" w:colLast="0" w:name="l8jlmc5dlaac" w:id="6"/>
+      <w:r>
+        <w:fldChar w:fldCharType="separate"/>
+      </w:r>
+      <w:bookmarkEnd w:id="6"/>
+      <w:r>
         <w:rPr>
           <w:rFonts w:ascii="Arial" w:cs="Arial" w:eastAsia="Arial" w:hAnsi="Arial"/>
           <w:b w:val="0"/>
@@ -21021,11 +21293,81 @@
           <w:vertAlign w:val="baseline"/>
           <w:rtl w:val="0"/>
         </w:rPr>
-        <w:t xml:space="preserve">_Assigned to mfgallagher@ucdavis.edu_</w:t>
-      </w:r>
-    </w:p>
-  </w:comment>
-  <w:comment w:author="Maggie Gallagher" w:id="10" w:date="2026-09-21T16:39:43Z">
+        <w:t xml:space="preserve">@mfgallagher@ucdavis.edu</w:t>
+      </w:r>
+      <w:r>
+        <w:fldChar w:fldCharType="end"/>
+      </w:r>
+      <w:r>
+        <w:rPr>
+          <w:rFonts w:ascii="Arial" w:cs="Arial" w:eastAsia="Arial" w:hAnsi="Arial"/>
+          <w:b w:val="0"/>
+          <w:bCs w:val="0"/>
+          <w:i w:val="0"/>
+          <w:iCs w:val="0"/>
+          <w:smallCaps w:val="0"/>
+          <w:strike w:val="0"/>
+          <w:color w:val="000000"/>
+          <w:sz w:val="22"/>
+          <w:szCs w:val="22"/>
+          <w:u w:val="none"/>
+          <w:shd w:fill="auto" w:val="clear"/>
+          <w:vertAlign w:val="baseline"/>
+          <w:rtl w:val="0"/>
+        </w:rPr>
+        <w:t xml:space="preserve"> </w:t>
+      </w:r>
+      <w:r>
+        <w:fldChar w:fldCharType="begin"/>
+        <w:instrText xml:space="preserve"> HYPERLINK "mailto:bmilligan@ucdavis.edu" </w:instrText>
+      </w:r>
+      <w:bookmarkStart w:colFirst="0" w:colLast="0" w:name="r2tqnsabe17b" w:id="7"/>
+      <w:r>
+        <w:fldChar w:fldCharType="separate"/>
+      </w:r>
+      <w:bookmarkEnd w:id="7"/>
+      <w:r>
+        <w:rPr>
+          <w:rFonts w:ascii="Arial" w:cs="Arial" w:eastAsia="Arial" w:hAnsi="Arial"/>
+          <w:b w:val="0"/>
+          <w:bCs w:val="0"/>
+          <w:i w:val="0"/>
+          <w:iCs w:val="0"/>
+          <w:smallCaps w:val="0"/>
+          <w:strike w:val="0"/>
+          <w:color w:val="000000"/>
+          <w:sz w:val="22"/>
+          <w:szCs w:val="22"/>
+          <w:u w:val="none"/>
+          <w:shd w:fill="auto" w:val="clear"/>
+          <w:vertAlign w:val="baseline"/>
+          <w:rtl w:val="0"/>
+        </w:rPr>
+        <w:t xml:space="preserve">@bmilligan@ucdavis.edu</w:t>
+      </w:r>
+      <w:r>
+        <w:fldChar w:fldCharType="end"/>
+      </w:r>
+      <w:r>
+        <w:rPr>
+          <w:rFonts w:ascii="Arial" w:cs="Arial" w:eastAsia="Arial" w:hAnsi="Arial"/>
+          <w:b w:val="0"/>
+          <w:bCs w:val="0"/>
+          <w:i w:val="0"/>
+          <w:iCs w:val="0"/>
+          <w:smallCaps w:val="0"/>
+          <w:strike w:val="0"/>
+          <w:color w:val="000000"/>
+          <w:sz w:val="22"/>
+          <w:szCs w:val="22"/>
+          <w:u w:val="none"/>
+          <w:shd w:fill="auto" w:val="clear"/>
+          <w:vertAlign w:val="baseline"/>
+          <w:rtl w:val="0"/>
+        </w:rPr>
+        <w:t xml:space="preserve">  This does not include the tiered outflow, correct?</w:t>
+      </w:r>
+    </w:p>
     <w:p>
       <w:pPr>
         <w:keepNext w:val="0"/>
@@ -21076,11 +21418,11 @@
           <w:vertAlign w:val="baseline"/>
           <w:rtl w:val="0"/>
         </w:rPr>
-        <w:t xml:space="preserve">The upland scenarios arent connected to the tiered outflows at all. Not sure about the in-delta scenarios</w:t>
+        <w:t xml:space="preserve">Assigned to mfgallagher@ucdavis.edu</w:t>
       </w:r>
     </w:p>
   </w:comment>
-  <w:comment w:author="Ana Zepeda" w:id="28" w:date="2026-09-16T02:28:53Z">
+  <w:comment w:author="Maggie Gallagher" w:id="11" w:date="2026-09-21T16:39:43Z">
     <w:p>
       <w:pPr>
         <w:keepNext w:val="0"/>
@@ -21131,11 +21473,11 @@
           <w:vertAlign w:val="baseline"/>
           <w:rtl w:val="0"/>
         </w:rPr>
-        <w:t xml:space="preserve">Personally, I agree with this statement but I am unsure we can say this about the entire team without having everyone agree?</w:t>
+        <w:t xml:space="preserve">The upland scenarios arent connected to the tiered outflows at all. Not sure about the in-delta scenarios</w:t>
       </w:r>
     </w:p>
   </w:comment>
-  <w:comment w:author="Ana Zepeda" w:id="29" w:date="2026-09-16T02:29:29Z">
+  <w:comment w:author="Ana Zepeda" w:id="29" w:date="2026-09-16T02:28:53Z">
     <w:p>
       <w:pPr>
         <w:keepNext w:val="0"/>
@@ -21186,11 +21528,11 @@
           <w:vertAlign w:val="baseline"/>
           <w:rtl w:val="0"/>
         </w:rPr>
-        <w:t xml:space="preserve">i.e. get their consent / approval to state this because it is what they believe</w:t>
+        <w:t xml:space="preserve">Personally, I agree with this statement but I am unsure we can say this about the entire team without having everyone agree?</w:t>
       </w:r>
     </w:p>
   </w:comment>
-  <w:comment w:author="Ashley N. DePew" w:id="24" w:date="2026-09-18T04:19:50Z">
+  <w:comment w:author="Ana Zepeda" w:id="30" w:date="2026-09-16T02:29:29Z">
     <w:p>
       <w:pPr>
         <w:keepNext w:val="0"/>
@@ -21241,11 +21583,11 @@
           <w:vertAlign w:val="baseline"/>
           <w:rtl w:val="0"/>
         </w:rPr>
-        <w:t xml:space="preserve">what is the incrimental difference between the scores? How did we come to NGW 4 and eco 1?</w:t>
+        <w:t xml:space="preserve">i.e. get their consent / approval to state this because it is what they believe</w:t>
       </w:r>
     </w:p>
   </w:comment>
-  <w:comment w:author="Ashley N. DePew" w:id="25" w:date="2026-09-18T04:20:38Z">
+  <w:comment w:author="Ashley N. DePew" w:id="25" w:date="2026-09-18T04:19:50Z">
     <w:p>
       <w:pPr>
         <w:keepNext w:val="0"/>
@@ -21296,9 +21638,11 @@
           <w:vertAlign w:val="baseline"/>
           <w:rtl w:val="0"/>
         </w:rPr>
-        <w:t xml:space="preserve">I will edit this but need to come back once I understand how the ranking system is set up</w:t>
-      </w:r>
-    </w:p>
+        <w:t xml:space="preserve">what is the incrimental difference between the scores? How did we come to NGW 4 and eco 1?</w:t>
+      </w:r>
+    </w:p>
+  </w:comment>
+  <w:comment w:author="Ashley N. DePew" w:id="26" w:date="2026-09-18T04:20:38Z">
     <w:p>
       <w:pPr>
         <w:keepNext w:val="0"/>
@@ -21349,11 +21693,14 @@
           <w:vertAlign w:val="baseline"/>
           <w:rtl w:val="0"/>
         </w:rPr>
-        <w:t xml:space="preserve">@amzepeda@ucdavis.edu @bmilligan@ucdavis.edu</w:t>
-      </w:r>
-    </w:p>
-  </w:comment>
-  <w:comment w:author="Ashley N. DePew" w:id="0" w:date="2026-09-15T20:25:39Z">
+        <w:t xml:space="preserve">I will edit this but need to come back once I understand how the ranking system is set up</w:t>
+      </w:r>
+      <w:r>
+        <w:rPr>
+          <w:rtl w:val="0"/>
+        </w:rPr>
+      </w:r>
+    </w:p>
     <w:p>
       <w:pPr>
         <w:keepNext w:val="0"/>
@@ -21389,6 +21736,20 @@
       </w:pPr>
       <w:r>
         <w:rPr>
+          <w:rtl w:val="0"/>
+        </w:rPr>
+      </w:r>
+      <w:r>
+        <w:fldChar w:fldCharType="begin"/>
+        <w:instrText xml:space="preserve"> HYPERLINK "mailto:amzepeda@ucdavis.edu" </w:instrText>
+      </w:r>
+      <w:bookmarkStart w:colFirst="0" w:colLast="0" w:name="pkx9r7x32flg" w:id="8"/>
+      <w:r>
+        <w:fldChar w:fldCharType="separate"/>
+      </w:r>
+      <w:bookmarkEnd w:id="8"/>
+      <w:r>
+        <w:rPr>
           <w:rFonts w:ascii="Arial" w:cs="Arial" w:eastAsia="Arial" w:hAnsi="Arial"/>
           <w:b w:val="0"/>
           <w:bCs w:val="0"/>
@@ -21404,11 +21765,64 @@
           <w:vertAlign w:val="baseline"/>
           <w:rtl w:val="0"/>
         </w:rPr>
-        <w:t xml:space="preserve">phase 1 report appendix D</w:t>
+        <w:t xml:space="preserve">@amzepeda@ucdavis.edu</w:t>
+      </w:r>
+      <w:r>
+        <w:fldChar w:fldCharType="end"/>
+      </w:r>
+      <w:r>
+        <w:rPr>
+          <w:rFonts w:ascii="Arial" w:cs="Arial" w:eastAsia="Arial" w:hAnsi="Arial"/>
+          <w:b w:val="0"/>
+          <w:bCs w:val="0"/>
+          <w:i w:val="0"/>
+          <w:iCs w:val="0"/>
+          <w:smallCaps w:val="0"/>
+          <w:strike w:val="0"/>
+          <w:color w:val="000000"/>
+          <w:sz w:val="22"/>
+          <w:szCs w:val="22"/>
+          <w:u w:val="none"/>
+          <w:shd w:fill="auto" w:val="clear"/>
+          <w:vertAlign w:val="baseline"/>
+          <w:rtl w:val="0"/>
+        </w:rPr>
+        <w:t xml:space="preserve"> </w:t>
+      </w:r>
+      <w:r>
+        <w:fldChar w:fldCharType="begin"/>
+        <w:instrText xml:space="preserve"> HYPERLINK "mailto:bmilligan@ucdavis.edu" </w:instrText>
+      </w:r>
+      <w:bookmarkStart w:colFirst="0" w:colLast="0" w:name="85ib7g8bmxvw" w:id="9"/>
+      <w:r>
+        <w:fldChar w:fldCharType="separate"/>
+      </w:r>
+      <w:bookmarkEnd w:id="9"/>
+      <w:r>
+        <w:rPr>
+          <w:rFonts w:ascii="Arial" w:cs="Arial" w:eastAsia="Arial" w:hAnsi="Arial"/>
+          <w:b w:val="0"/>
+          <w:bCs w:val="0"/>
+          <w:i w:val="0"/>
+          <w:iCs w:val="0"/>
+          <w:smallCaps w:val="0"/>
+          <w:strike w:val="0"/>
+          <w:color w:val="000000"/>
+          <w:sz w:val="22"/>
+          <w:szCs w:val="22"/>
+          <w:u w:val="none"/>
+          <w:shd w:fill="auto" w:val="clear"/>
+          <w:vertAlign w:val="baseline"/>
+          <w:rtl w:val="0"/>
+        </w:rPr>
+        <w:t xml:space="preserve">@bmilligan@ucdavis.edu</w:t>
+      </w:r>
+      <w:r>
+        <w:fldChar w:fldCharType="end"/>
       </w:r>
     </w:p>
   </w:comment>
-  <w:comment w:author="Ana Zepeda" w:id="1" w:date="2026-09-16T02:00:01Z">
+  <w:comment w:author="Ashley N. DePew" w:id="0" w:date="2026-09-15T20:25:39Z">
     <w:p>
       <w:pPr>
         <w:keepNext w:val="0"/>
@@ -21459,11 +21873,11 @@
           <w:vertAlign w:val="baseline"/>
           <w:rtl w:val="0"/>
         </w:rPr>
-        <w:t xml:space="preserve">For some reason when we link to the report in the comments the link does not work.</w:t>
+        <w:t xml:space="preserve">phase 1 report appendix D</w:t>
       </w:r>
     </w:p>
   </w:comment>
-  <w:comment w:author="Ashley N. DePew" w:id="27" w:date="2026-09-18T04:21:50Z">
+  <w:comment w:author="Ana Zepeda" w:id="1" w:date="2026-09-16T02:00:01Z">
     <w:p>
       <w:pPr>
         <w:keepNext w:val="0"/>
@@ -21514,11 +21928,11 @@
           <w:vertAlign w:val="baseline"/>
           <w:rtl w:val="0"/>
         </w:rPr>
-        <w:t xml:space="preserve">I will edit this section once I understand the ranking so that I can paint a picture with how I write this. @bmilligan@ucdavis.edu just fyi</w:t>
+        <w:t xml:space="preserve">For some reason when we link to the report in the comments the link does not work.</w:t>
       </w:r>
     </w:p>
   </w:comment>
-  <w:comment w:author="Ana Zepeda" w:id="20" w:date="2026-09-16T19:15:48Z">
+  <w:comment w:author="Ashley N. DePew" w:id="28" w:date="2026-09-18T04:21:50Z">
     <w:p>
       <w:pPr>
         <w:keepNext w:val="0"/>
@@ -21569,11 +21983,61 @@
           <w:vertAlign w:val="baseline"/>
           <w:rtl w:val="0"/>
         </w:rPr>
-        <w:t xml:space="preserve">they don't clarify why they call it a CCE when legally it is a CE. Don't know if to include.</w:t>
+        <w:t xml:space="preserve">I will edit this section once I understand the ranking so that I can paint a picture with how I write this. </w:t>
+      </w:r>
+      <w:r>
+        <w:fldChar w:fldCharType="begin"/>
+        <w:instrText xml:space="preserve"> HYPERLINK "mailto:bmilligan@ucdavis.edu" </w:instrText>
+      </w:r>
+      <w:bookmarkStart w:colFirst="0" w:colLast="0" w:name="5xt78hn89f8s" w:id="10"/>
+      <w:r>
+        <w:fldChar w:fldCharType="separate"/>
+      </w:r>
+      <w:bookmarkEnd w:id="10"/>
+      <w:r>
+        <w:rPr>
+          <w:rFonts w:ascii="Arial" w:cs="Arial" w:eastAsia="Arial" w:hAnsi="Arial"/>
+          <w:b w:val="0"/>
+          <w:bCs w:val="0"/>
+          <w:i w:val="0"/>
+          <w:iCs w:val="0"/>
+          <w:smallCaps w:val="0"/>
+          <w:strike w:val="0"/>
+          <w:color w:val="000000"/>
+          <w:sz w:val="22"/>
+          <w:szCs w:val="22"/>
+          <w:u w:val="none"/>
+          <w:shd w:fill="auto" w:val="clear"/>
+          <w:vertAlign w:val="baseline"/>
+          <w:rtl w:val="0"/>
+        </w:rPr>
+        <w:t xml:space="preserve">@bmilligan@ucdavis.edu</w:t>
+      </w:r>
+      <w:r>
+        <w:fldChar w:fldCharType="end"/>
+      </w:r>
+      <w:r>
+        <w:rPr>
+          <w:rFonts w:ascii="Arial" w:cs="Arial" w:eastAsia="Arial" w:hAnsi="Arial"/>
+          <w:b w:val="0"/>
+          <w:bCs w:val="0"/>
+          <w:i w:val="0"/>
+          <w:iCs w:val="0"/>
+          <w:smallCaps w:val="0"/>
+          <w:strike w:val="0"/>
+          <w:color w:val="000000"/>
+          <w:sz w:val="22"/>
+          <w:szCs w:val="22"/>
+          <w:u w:val="none"/>
+          <w:shd w:fill="auto" w:val="clear"/>
+          <w:vertAlign w:val="baseline"/>
+          <w:rtl w:val="0"/>
+        </w:rPr>
+        <w:t xml:space="preserve"> just fyi</w:t>
       </w:r>
     </w:p>
   </w:comment>
-  <w:comment w:author="Ashley N. DePew" w:id="18" w:date="2026-09-15T20:55:23Z">
+  <w:comment w:author="Ana Zepeda" w:id="21" w:date="2026-09-16T19:15:48Z">
     <w:p>
       <w:pPr>
         <w:keepNext w:val="0"/>
@@ -21624,9 +22088,11 @@
           <w:vertAlign w:val="baseline"/>
           <w:rtl w:val="0"/>
         </w:rPr>
-        <w:t xml:space="preserve">I would assume these are the scenarios where this would happen, but we shouldn't count out the others... thoughts @bmilligan@ucdavis.edu ?</w:t>
-      </w:r>
-    </w:p>
+        <w:t xml:space="preserve">they don't clarify why they call it a CCE when legally it is a CE. Don't know if to include.</w:t>
+      </w:r>
+    </w:p>
+  </w:comment>
+  <w:comment w:author="Ashley N. DePew" w:id="19" w:date="2026-09-15T20:55:23Z">
     <w:p>
       <w:pPr>
         <w:keepNext w:val="0"/>
@@ -21677,7 +22143,57 @@
           <w:vertAlign w:val="baseline"/>
           <w:rtl w:val="0"/>
         </w:rPr>
-        <w:t xml:space="preserve">1 total reaction</w:t>
+        <w:t xml:space="preserve">I would assume these are the scenarios where this would happen, but we shouldn't count out the others... thoughts </w:t>
+      </w:r>
+      <w:r>
+        <w:fldChar w:fldCharType="begin"/>
+        <w:instrText xml:space="preserve"> HYPERLINK "mailto:bmilligan@ucdavis.edu" </w:instrText>
+      </w:r>
+      <w:bookmarkStart w:colFirst="0" w:colLast="0" w:name="f4ngx728zfqc" w:id="11"/>
+      <w:r>
+        <w:fldChar w:fldCharType="separate"/>
+      </w:r>
+      <w:bookmarkEnd w:id="11"/>
+      <w:r>
+        <w:rPr>
+          <w:rFonts w:ascii="Arial" w:cs="Arial" w:eastAsia="Arial" w:hAnsi="Arial"/>
+          <w:b w:val="0"/>
+          <w:bCs w:val="0"/>
+          <w:i w:val="0"/>
+          <w:iCs w:val="0"/>
+          <w:smallCaps w:val="0"/>
+          <w:strike w:val="0"/>
+          <w:color w:val="000000"/>
+          <w:sz w:val="22"/>
+          <w:szCs w:val="22"/>
+          <w:u w:val="none"/>
+          <w:shd w:fill="auto" w:val="clear"/>
+          <w:vertAlign w:val="baseline"/>
+          <w:rtl w:val="0"/>
+        </w:rPr>
+        <w:t xml:space="preserve">@bmilligan@ucdavis.edu</w:t>
+      </w:r>
+      <w:r>
+        <w:fldChar w:fldCharType="end"/>
+      </w:r>
+      <w:r>
+        <w:rPr>
+          <w:rFonts w:ascii="Arial" w:cs="Arial" w:eastAsia="Arial" w:hAnsi="Arial"/>
+          <w:b w:val="0"/>
+          <w:bCs w:val="0"/>
+          <w:i w:val="0"/>
+          <w:iCs w:val="0"/>
+          <w:smallCaps w:val="0"/>
+          <w:strike w:val="0"/>
+          <w:color w:val="000000"/>
+          <w:sz w:val="22"/>
+          <w:szCs w:val="22"/>
+          <w:u w:val="none"/>
+          <w:shd w:fill="auto" w:val="clear"/>
+          <w:vertAlign w:val="baseline"/>
+          <w:rtl w:val="0"/>
+        </w:rPr>
+        <w:t xml:space="preserve"> ?</w:t>
       </w:r>
     </w:p>
     <w:p>
@@ -21730,11 +22246,9 @@
           <w:vertAlign w:val="baseline"/>
           <w:rtl w:val="0"/>
         </w:rPr>
-        <w:t xml:space="preserve">Ana Zepeda reacted with 👍 at 09/16/2026, 2:27 AM UTC</w:t>
-      </w:r>
-    </w:p>
-  </w:comment>
-  <w:comment w:author="Ana Zepeda" w:id="11" w:date="2026-09-18T16:53:17Z">
+        <w:t xml:space="preserve">1 total reaction</w:t>
+      </w:r>
+    </w:p>
     <w:p>
       <w:pPr>
         <w:keepNext w:val="0"/>
@@ -21785,11 +22299,11 @@
           <w:vertAlign w:val="baseline"/>
           <w:rtl w:val="0"/>
         </w:rPr>
-        <w:t xml:space="preserve">@mfgallagher@ucdavis.edu is this table the same as table 3 except with % of restored acres vs actual acreage?</w:t>
+        <w:t xml:space="preserve">Ana Zepeda reacted with 👍 at 09/16/2026, 2:27 AM UTC</w:t>
       </w:r>
     </w:p>
   </w:comment>
-  <w:comment w:author="Maggie Gallagher" w:id="12" w:date="2026-09-21T16:40:36Z">
+  <w:comment w:author="Ana Zepeda" w:id="12" w:date="2026-09-18T16:53:17Z">
     <w:p>
       <w:pPr>
         <w:keepNext w:val="0"/>
@@ -21824,6 +22338,15 @@
         </w:rPr>
       </w:pPr>
       <w:r>
+        <w:fldChar w:fldCharType="begin"/>
+        <w:instrText xml:space="preserve"> HYPERLINK "mailto:mfgallagher@ucdavis.edu" </w:instrText>
+      </w:r>
+      <w:bookmarkStart w:colFirst="0" w:colLast="0" w:name="2djprsk4je38" w:id="12"/>
+      <w:r>
+        <w:fldChar w:fldCharType="separate"/>
+      </w:r>
+      <w:bookmarkEnd w:id="12"/>
+      <w:r>
         <w:rPr>
           <w:rFonts w:ascii="Arial" w:cs="Arial" w:eastAsia="Arial" w:hAnsi="Arial"/>
           <w:b w:val="0"/>
@@ -21840,11 +22363,33 @@
           <w:vertAlign w:val="baseline"/>
           <w:rtl w:val="0"/>
         </w:rPr>
-        <w:t xml:space="preserve">Yes! if you think its superfluous feel free to remove. I was including it to illustrate the method we used to arrive at the acreages.</w:t>
+        <w:t xml:space="preserve">@mfgallagher@ucdavis.edu</w:t>
+      </w:r>
+      <w:r>
+        <w:fldChar w:fldCharType="end"/>
+      </w:r>
+      <w:r>
+        <w:rPr>
+          <w:rFonts w:ascii="Arial" w:cs="Arial" w:eastAsia="Arial" w:hAnsi="Arial"/>
+          <w:b w:val="0"/>
+          <w:bCs w:val="0"/>
+          <w:i w:val="0"/>
+          <w:iCs w:val="0"/>
+          <w:smallCaps w:val="0"/>
+          <w:strike w:val="0"/>
+          <w:color w:val="000000"/>
+          <w:sz w:val="22"/>
+          <w:szCs w:val="22"/>
+          <w:u w:val="none"/>
+          <w:shd w:fill="auto" w:val="clear"/>
+          <w:vertAlign w:val="baseline"/>
+          <w:rtl w:val="0"/>
+        </w:rPr>
+        <w:t xml:space="preserve"> is this table the same as table 3 except with % of restored acres vs actual acreage?</w:t>
       </w:r>
     </w:p>
   </w:comment>
-  <w:comment w:author="Ashley N. DePew" w:id="19" w:date="2026-09-15T20:53:00Z">
+  <w:comment w:author="Maggie Gallagher" w:id="13" w:date="2026-09-21T16:40:36Z">
     <w:p>
       <w:pPr>
         <w:keepNext w:val="0"/>
@@ -21895,11 +22440,11 @@
           <w:vertAlign w:val="baseline"/>
           <w:rtl w:val="0"/>
         </w:rPr>
-        <w:t xml:space="preserve">@bmilligan@ucdavis.edu correct?</w:t>
+        <w:t xml:space="preserve">Yes! if you think its superfluous feel free to remove. I was including it to illustrate the method we used to arrive at the acreages.</w:t>
       </w:r>
     </w:p>
   </w:comment>
-  <w:comment w:author="Ashley N. DePew" w:id="26" w:date="2026-09-21T22:17:15Z">
+  <w:comment w:author="Ashley N. DePew" w:id="20" w:date="2026-09-15T20:53:00Z">
     <w:p>
       <w:pPr>
         <w:keepNext w:val="0"/>
@@ -21934,6 +22479,15 @@
         </w:rPr>
       </w:pPr>
       <w:r>
+        <w:fldChar w:fldCharType="begin"/>
+        <w:instrText xml:space="preserve"> HYPERLINK "mailto:bmilligan@ucdavis.edu" </w:instrText>
+      </w:r>
+      <w:bookmarkStart w:colFirst="0" w:colLast="0" w:name="yhylt1kcxfwg" w:id="13"/>
+      <w:r>
+        <w:fldChar w:fldCharType="separate"/>
+      </w:r>
+      <w:bookmarkEnd w:id="13"/>
+      <w:r>
         <w:rPr>
           <w:rFonts w:ascii="Arial" w:cs="Arial" w:eastAsia="Arial" w:hAnsi="Arial"/>
           <w:b w:val="0"/>
@@ -21950,11 +22504,33 @@
           <w:vertAlign w:val="baseline"/>
           <w:rtl w:val="0"/>
         </w:rPr>
-        <w:t xml:space="preserve">@bmilligan@ucdavis.edu do we think A Tunnel and 10% outflow decrease are equally as bad?</w:t>
+        <w:t xml:space="preserve">@bmilligan@ucdavis.edu</w:t>
+      </w:r>
+      <w:r>
+        <w:fldChar w:fldCharType="end"/>
+      </w:r>
+      <w:r>
+        <w:rPr>
+          <w:rFonts w:ascii="Arial" w:cs="Arial" w:eastAsia="Arial" w:hAnsi="Arial"/>
+          <w:b w:val="0"/>
+          <w:bCs w:val="0"/>
+          <w:i w:val="0"/>
+          <w:iCs w:val="0"/>
+          <w:smallCaps w:val="0"/>
+          <w:strike w:val="0"/>
+          <w:color w:val="000000"/>
+          <w:sz w:val="22"/>
+          <w:szCs w:val="22"/>
+          <w:u w:val="none"/>
+          <w:shd w:fill="auto" w:val="clear"/>
+          <w:vertAlign w:val="baseline"/>
+          <w:rtl w:val="0"/>
+        </w:rPr>
+        <w:t xml:space="preserve"> correct?</w:t>
       </w:r>
     </w:p>
   </w:comment>
-  <w:comment w:author="Ashley N. DePew" w:id="3" w:date="2026-09-15T04:56:29Z">
+  <w:comment w:author="Ashley N. DePew" w:id="27" w:date="2026-09-21T22:17:15Z">
     <w:p>
       <w:pPr>
         <w:keepNext w:val="0"/>
@@ -21989,6 +22565,15 @@
         </w:rPr>
       </w:pPr>
       <w:r>
+        <w:fldChar w:fldCharType="begin"/>
+        <w:instrText xml:space="preserve"> HYPERLINK "mailto:bmilligan@ucdavis.edu" </w:instrText>
+      </w:r>
+      <w:bookmarkStart w:colFirst="0" w:colLast="0" w:name="2w6unc4dzct2" w:id="14"/>
+      <w:r>
+        <w:fldChar w:fldCharType="separate"/>
+      </w:r>
+      <w:bookmarkEnd w:id="14"/>
+      <w:r>
         <w:rPr>
           <w:rFonts w:ascii="Arial" w:cs="Arial" w:eastAsia="Arial" w:hAnsi="Arial"/>
           <w:b w:val="0"/>
@@ -22005,11 +22590,196 @@
           <w:vertAlign w:val="baseline"/>
           <w:rtl w:val="0"/>
         </w:rPr>
+        <w:t xml:space="preserve">@bmilligan@ucdavis.edu</w:t>
+      </w:r>
+      <w:r>
+        <w:fldChar w:fldCharType="end"/>
+      </w:r>
+      <w:r>
+        <w:rPr>
+          <w:rFonts w:ascii="Arial" w:cs="Arial" w:eastAsia="Arial" w:hAnsi="Arial"/>
+          <w:b w:val="0"/>
+          <w:bCs w:val="0"/>
+          <w:i w:val="0"/>
+          <w:iCs w:val="0"/>
+          <w:smallCaps w:val="0"/>
+          <w:strike w:val="0"/>
+          <w:color w:val="000000"/>
+          <w:sz w:val="22"/>
+          <w:szCs w:val="22"/>
+          <w:u w:val="none"/>
+          <w:shd w:fill="auto" w:val="clear"/>
+          <w:vertAlign w:val="baseline"/>
+          <w:rtl w:val="0"/>
+        </w:rPr>
+        <w:t xml:space="preserve"> do we think A Tunnel and 10% outflow decrease are equally as bad?</w:t>
+      </w:r>
+    </w:p>
+  </w:comment>
+  <w:comment w:author="Ashley N. DePew" w:id="3" w:date="2026-09-15T04:56:29Z">
+    <w:p>
+      <w:pPr>
+        <w:keepNext w:val="0"/>
+        <w:keepLines w:val="0"/>
+        <w:pageBreakBefore w:val="0"/>
+        <w:widowControl w:val="0"/>
+        <w:pBdr>
+          <w:top w:space="0" w:sz="0" w:val="nil"/>
+          <w:left w:space="0" w:sz="0" w:val="nil"/>
+          <w:bottom w:space="0" w:sz="0" w:val="nil"/>
+          <w:right w:space="0" w:sz="0" w:val="nil"/>
+          <w:between w:space="0" w:sz="0" w:val="nil"/>
+        </w:pBdr>
+        <w:shd w:fill="auto" w:val="clear"/>
+        <w:spacing w:after="0" w:before="0" w:line="240" w:lineRule="auto"/>
+        <w:ind w:left="0" w:right="0" w:firstLine="0"/>
+        <w:jc w:val="left"/>
+        <w:rPr>
+          <w:rFonts w:ascii="Arial" w:cs="Arial" w:eastAsia="Arial" w:hAnsi="Arial"/>
+          <w:b w:val="0"/>
+          <w:bCs w:val="0"/>
+          <w:i w:val="0"/>
+          <w:iCs w:val="0"/>
+          <w:smallCaps w:val="0"/>
+          <w:strike w:val="0"/>
+          <w:color w:val="000000"/>
+          <w:sz w:val="22"/>
+          <w:szCs w:val="22"/>
+          <w:u w:val="none"/>
+          <w:shd w:fill="auto" w:val="clear"/>
+          <w:vertAlign w:val="baseline"/>
+        </w:rPr>
+      </w:pPr>
+      <w:r>
+        <w:rPr>
+          <w:rFonts w:ascii="Arial" w:cs="Arial" w:eastAsia="Arial" w:hAnsi="Arial"/>
+          <w:b w:val="0"/>
+          <w:bCs w:val="0"/>
+          <w:i w:val="0"/>
+          <w:iCs w:val="0"/>
+          <w:smallCaps w:val="0"/>
+          <w:strike w:val="0"/>
+          <w:color w:val="000000"/>
+          <w:sz w:val="22"/>
+          <w:szCs w:val="22"/>
+          <w:u w:val="none"/>
+          <w:shd w:fill="auto" w:val="clear"/>
+          <w:vertAlign w:val="baseline"/>
+          <w:rtl w:val="0"/>
+        </w:rPr>
         <w:t xml:space="preserve">add citation</w:t>
       </w:r>
     </w:p>
   </w:comment>
 </w:comments>
+</file>
+
+<file path=word/commentsExtended.xml><?xml version="1.0" encoding="utf-8"?>
+<w15:commentsEx xmlns:mc="http://schemas.openxmlformats.org/markup-compatibility/2006" xmlns:o="urn:schemas-microsoft-com:office:office" xmlns:r="http://schemas.openxmlformats.org/officeDocument/2006/relationships" xmlns:m="http://schemas.openxmlformats.org/officeDocument/2006/math" xmlns:v="urn:schemas-microsoft-com:vml" xmlns:wp="http://schemas.openxmlformats.org/drawingml/2006/wordprocessingDrawing" xmlns:w10="urn:schemas-microsoft-com:office:word" xmlns:w="http://schemas.openxmlformats.org/wordprocessingml/2006/main" xmlns:wne="http://schemas.microsoft.com/office/word/2006/wordml" xmlns:sl="http://schemas.openxmlformats.org/schemaLibrary/2006/main" xmlns:a="http://schemas.openxmlformats.org/drawingml/2006/main" xmlns:pic="http://schemas.openxmlformats.org/drawingml/2006/picture" xmlns:c="http://schemas.openxmlformats.org/drawingml/2006/chart" xmlns:lc="http://schemas.openxmlformats.org/drawingml/2006/lockedCanvas" xmlns:dgm="http://schemas.openxmlformats.org/drawingml/2006/diagram" xmlns:wps="http://schemas.microsoft.com/office/word/2010/wordprocessingShape" xmlns:wpg="http://schemas.microsoft.com/office/word/2010/wordprocessingGroup" xmlns:w14="http://schemas.microsoft.com/office/word/2010/wordml" xmlns:w15="http://schemas.microsoft.com/office/word/2012/wordml" xmlns:w16="http://schemas.microsoft.com/office/word/2018/wordml" xmlns:w16cex="http://schemas.microsoft.com/office/word/2018/wordml/cex" xmlns:w16cid="http://schemas.microsoft.com/office/word/2016/wordml/cid" xmlns="http://schemas.microsoft.com/office/tasks/2019/documenttasks" xmlns:cr="http://schemas.microsoft.com/office/comments/2020/reactions">
+  <w15:commentEx w15:paraId="0000029F" w15:done="0"/>
+  <w15:commentEx w15:paraId="000002A0" w15:paraIdParent="0000029F" w15:done="0"/>
+  <w15:commentEx w15:paraId="000002A1" w15:paraIdParent="0000029F" w15:done="0"/>
+  <w15:commentEx w15:paraId="000002A2" w15:paraIdParent="0000029F" w15:done="0"/>
+  <w15:commentEx w15:paraId="000002A3" w15:paraIdParent="0000029F" w15:done="0"/>
+  <w15:commentEx w15:paraId="000002A4" w15:done="0"/>
+  <w15:commentEx w15:paraId="000002A5" w15:done="0"/>
+  <w15:commentEx w15:paraId="000002A6" w15:paraIdParent="000002A5" w15:done="0"/>
+  <w15:commentEx w15:paraId="000002A7" w15:done="0"/>
+  <w15:commentEx w15:paraId="000002A8" w15:done="0"/>
+  <w15:commentEx w15:paraId="000002A9" w15:paraIdParent="000002A8" w15:done="0"/>
+  <w15:commentEx w15:paraId="000002AA" w15:done="0"/>
+  <w15:commentEx w15:paraId="000002AB" w15:done="0"/>
+  <w15:commentEx w15:paraId="000002AC" w15:paraIdParent="000002AB" w15:done="0"/>
+  <w15:commentEx w15:paraId="000002AD" w15:paraIdParent="000002AB" w15:done="0"/>
+  <w15:commentEx w15:paraId="000002AF" w15:done="0"/>
+  <w15:commentEx w15:paraId="000002B0" w15:paraIdParent="000002AF" w15:done="0"/>
+  <w15:commentEx w15:paraId="000002B1" w15:done="0"/>
+  <w15:commentEx w15:paraId="000002B2" w15:paraIdParent="000002B1" w15:done="0"/>
+  <w15:commentEx w15:paraId="000002B3" w15:done="0"/>
+  <w15:commentEx w15:paraId="000002B5" w15:done="0"/>
+  <w15:commentEx w15:paraId="000002B6" w15:done="0"/>
+  <w15:commentEx w15:paraId="000002B7" w15:paraIdParent="000002B6" w15:done="0"/>
+  <w15:commentEx w15:paraId="000002B8" w15:done="0"/>
+  <w15:commentEx w15:paraId="000002B9" w15:done="0"/>
+  <w15:commentEx w15:paraId="000002BC" w15:done="0"/>
+  <w15:commentEx w15:paraId="000002BD" w15:done="0"/>
+  <w15:commentEx w15:paraId="000002BE" w15:paraIdParent="000002BD" w15:done="0"/>
+  <w15:commentEx w15:paraId="000002BF" w15:done="0"/>
+  <w15:commentEx w15:paraId="000002C0" w15:done="0"/>
+  <w15:commentEx w15:paraId="000002C1" w15:done="0"/>
+</w15:commentsEx>
+</file>
+
+<file path=word/commentsExtensible.xml><?xml version="1.0" encoding="utf-8"?>
+<w16cex:commentsExtensible xmlns:mc="http://schemas.openxmlformats.org/markup-compatibility/2006" xmlns:o="urn:schemas-microsoft-com:office:office" xmlns:r="http://schemas.openxmlformats.org/officeDocument/2006/relationships" xmlns:m="http://schemas.openxmlformats.org/officeDocument/2006/math" xmlns:v="urn:schemas-microsoft-com:vml" xmlns:wp="http://schemas.openxmlformats.org/drawingml/2006/wordprocessingDrawing" xmlns:w10="urn:schemas-microsoft-com:office:word" xmlns:w="http://schemas.openxmlformats.org/wordprocessingml/2006/main" xmlns:wne="http://schemas.microsoft.com/office/word/2006/wordml" xmlns:sl="http://schemas.openxmlformats.org/schemaLibrary/2006/main" xmlns:a="http://schemas.openxmlformats.org/drawingml/2006/main" xmlns:pic="http://schemas.openxmlformats.org/drawingml/2006/picture" xmlns:c="http://schemas.openxmlformats.org/drawingml/2006/chart" xmlns:lc="http://schemas.openxmlformats.org/drawingml/2006/lockedCanvas" xmlns:dgm="http://schemas.openxmlformats.org/drawingml/2006/diagram" xmlns:wps="http://schemas.microsoft.com/office/word/2010/wordprocessingShape" xmlns:wpg="http://schemas.microsoft.com/office/word/2010/wordprocessingGroup" xmlns:w14="http://schemas.microsoft.com/office/word/2010/wordml" xmlns:w15="http://schemas.microsoft.com/office/word/2012/wordml" xmlns:w16="http://schemas.microsoft.com/office/word/2018/wordml" xmlns:w16cex="http://schemas.microsoft.com/office/word/2018/wordml/cex" xmlns:w16cid="http://schemas.microsoft.com/office/word/2016/wordml/cid" xmlns="http://schemas.microsoft.com/office/tasks/2019/documenttasks" xmlns:cr="http://schemas.microsoft.com/office/comments/2020/reactions">
+  <w16cex:commentExtensible w16cex:durableId="00000001" w16cex:dateUtc="2026-09-16T23:04:34Z"/>
+  <w16cex:commentExtensible w16cex:durableId="00000002" w16cex:dateUtc="2026-09-18T16:46:47Z"/>
+  <w16cex:commentExtensible w16cex:durableId="00000003" w16cex:dateUtc="2026-09-18T16:46:59Z"/>
+  <w16cex:commentExtensible w16cex:durableId="00000004" w16cex:dateUtc="2026-09-21T16:43:13Z"/>
+  <w16cex:commentExtensible w16cex:durableId="00000005" w16cex:dateUtc="2026-09-21T16:43:59Z"/>
+  <w16cex:commentExtensible w16cex:durableId="00000006" w16cex:dateUtc="2026-10-22T00:03:18Z"/>
+  <w16cex:commentExtensible w16cex:durableId="00000007" w16cex:dateUtc="2026-09-15T05:28:09Z"/>
+  <w16cex:commentExtensible w16cex:durableId="00000008" w16cex:dateUtc="2026-09-18T13:49:20Z"/>
+  <w16cex:commentExtensible w16cex:durableId="00000009" w16cex:dateUtc="2026-09-15T05:24:01Z"/>
+  <w16cex:commentExtensible w16cex:durableId="0000000A" w16cex:dateUtc="2026-09-15T05:21:04Z"/>
+  <w16cex:commentExtensible w16cex:durableId="0000000B" w16cex:dateUtc="2026-09-18T16:38:02Z"/>
+  <w16cex:commentExtensible w16cex:durableId="0000000C" w16cex:dateUtc="2026-09-15T22:43:04Z"/>
+  <w16cex:commentExtensible w16cex:durableId="0000000D" w16cex:dateUtc="2026-09-18T03:58:32Z"/>
+  <w16cex:commentExtensible w16cex:durableId="0000000E" w16cex:dateUtc="2026-09-18T14:01:05Z"/>
+  <w16cex:commentExtensible w16cex:durableId="0000000F" w16cex:dateUtc="2026-09-18T14:01:23Z"/>
+  <w16cex:commentExtensible w16cex:durableId="00000010" w16cex:dateUtc="2026-09-18T13:50:03Z"/>
+  <w16cex:commentExtensible w16cex:durableId="00000011" w16cex:dateUtc="2026-09-21T16:39:43Z"/>
+  <w16cex:commentExtensible w16cex:durableId="00000012" w16cex:dateUtc="2026-09-16T02:28:53Z"/>
+  <w16cex:commentExtensible w16cex:durableId="00000013" w16cex:dateUtc="2026-09-16T02:29:29Z"/>
+  <w16cex:commentExtensible w16cex:durableId="00000014" w16cex:dateUtc="2026-09-18T04:19:50Z"/>
+  <w16cex:commentExtensible w16cex:durableId="00000015" w16cex:dateUtc="2026-09-18T04:20:38Z"/>
+  <w16cex:commentExtensible w16cex:durableId="00000016" w16cex:dateUtc="2026-09-15T20:25:39Z"/>
+  <w16cex:commentExtensible w16cex:durableId="00000017" w16cex:dateUtc="2026-09-16T02:00:01Z"/>
+  <w16cex:commentExtensible w16cex:durableId="00000018" w16cex:dateUtc="2026-09-18T04:21:50Z"/>
+  <w16cex:commentExtensible w16cex:durableId="00000019" w16cex:dateUtc="2026-09-16T19:15:48Z"/>
+  <w16cex:commentExtensible w16cex:durableId="0000001A" w16cex:dateUtc="2026-09-15T20:55:23Z"/>
+  <w16cex:commentExtensible w16cex:durableId="0000001B" w16cex:dateUtc="2026-09-18T16:53:17Z"/>
+  <w16cex:commentExtensible w16cex:durableId="0000001C" w16cex:dateUtc="2026-09-21T16:40:36Z"/>
+  <w16cex:commentExtensible w16cex:durableId="0000001D" w16cex:dateUtc="2026-09-15T20:53:00Z"/>
+  <w16cex:commentExtensible w16cex:durableId="0000001E" w16cex:dateUtc="2026-09-21T22:17:15Z"/>
+  <w16cex:commentExtensible w16cex:durableId="0000001F" w16cex:dateUtc="2026-09-15T04:56:29Z"/>
+</w16cex:commentsExtensible>
+</file>
+
+<file path=word/commentsIds.xml><?xml version="1.0" encoding="utf-8"?>
+<w16cid:commentsIds xmlns:mc="http://schemas.openxmlformats.org/markup-compatibility/2006" xmlns:o="urn:schemas-microsoft-com:office:office" xmlns:r="http://schemas.openxmlformats.org/officeDocument/2006/relationships" xmlns:m="http://schemas.openxmlformats.org/officeDocument/2006/math" xmlns:v="urn:schemas-microsoft-com:vml" xmlns:wp="http://schemas.openxmlformats.org/drawingml/2006/wordprocessingDrawing" xmlns:w10="urn:schemas-microsoft-com:office:word" xmlns:w="http://schemas.openxmlformats.org/wordprocessingml/2006/main" xmlns:wne="http://schemas.microsoft.com/office/word/2006/wordml" xmlns:sl="http://schemas.openxmlformats.org/schemaLibrary/2006/main" xmlns:a="http://schemas.openxmlformats.org/drawingml/2006/main" xmlns:pic="http://schemas.openxmlformats.org/drawingml/2006/picture" xmlns:c="http://schemas.openxmlformats.org/drawingml/2006/chart" xmlns:lc="http://schemas.openxmlformats.org/drawingml/2006/lockedCanvas" xmlns:dgm="http://schemas.openxmlformats.org/drawingml/2006/diagram" xmlns:wps="http://schemas.microsoft.com/office/word/2010/wordprocessingShape" xmlns:wpg="http://schemas.microsoft.com/office/word/2010/wordprocessingGroup" xmlns:w14="http://schemas.microsoft.com/office/word/2010/wordml" xmlns:w15="http://schemas.microsoft.com/office/word/2012/wordml" xmlns:w16="http://schemas.microsoft.com/office/word/2018/wordml" xmlns:w16cex="http://schemas.microsoft.com/office/word/2018/wordml/cex" xmlns:w16cid="http://schemas.microsoft.com/office/word/2016/wordml/cid" xmlns="http://schemas.microsoft.com/office/tasks/2019/documenttasks" xmlns:cr="http://schemas.microsoft.com/office/comments/2020/reactions">
+  <w16cid:commentId w16cid:paraId="0000029F" w16cid:durableId="00000001"/>
+  <w16cid:commentId w16cid:paraId="000002A0" w16cid:durableId="00000002"/>
+  <w16cid:commentId w16cid:paraId="000002A1" w16cid:durableId="00000003"/>
+  <w16cid:commentId w16cid:paraId="000002A2" w16cid:durableId="00000004"/>
+  <w16cid:commentId w16cid:paraId="000002A3" w16cid:durableId="00000005"/>
+  <w16cid:commentId w16cid:paraId="000002A4" w16cid:durableId="00000006"/>
+  <w16cid:commentId w16cid:paraId="000002A5" w16cid:durableId="00000007"/>
+  <w16cid:commentId w16cid:paraId="000002A6" w16cid:durableId="00000008"/>
+  <w16cid:commentId w16cid:paraId="000002A7" w16cid:durableId="00000009"/>
+  <w16cid:commentId w16cid:paraId="000002A8" w16cid:durableId="0000000A"/>
+  <w16cid:commentId w16cid:paraId="000002A9" w16cid:durableId="0000000B"/>
+  <w16cid:commentId w16cid:paraId="000002AA" w16cid:durableId="0000000C"/>
+  <w16cid:commentId w16cid:paraId="000002AB" w16cid:durableId="0000000D"/>
+  <w16cid:commentId w16cid:paraId="000002AC" w16cid:durableId="0000000E"/>
+  <w16cid:commentId w16cid:paraId="000002AD" w16cid:durableId="0000000F"/>
+  <w16cid:commentId w16cid:paraId="000002AF" w16cid:durableId="00000010"/>
+  <w16cid:commentId w16cid:paraId="000002B0" w16cid:durableId="00000011"/>
+  <w16cid:commentId w16cid:paraId="000002B1" w16cid:durableId="00000012"/>
+  <w16cid:commentId w16cid:paraId="000002B2" w16cid:durableId="00000013"/>
+  <w16cid:commentId w16cid:paraId="000002B3" w16cid:durableId="00000014"/>
+  <w16cid:commentId w16cid:paraId="000002B5" w16cid:durableId="00000015"/>
+  <w16cid:commentId w16cid:paraId="000002B6" w16cid:durableId="00000016"/>
+  <w16cid:commentId w16cid:paraId="000002B7" w16cid:durableId="00000017"/>
+  <w16cid:commentId w16cid:paraId="000002B8" w16cid:durableId="00000018"/>
+  <w16cid:commentId w16cid:paraId="000002B9" w16cid:durableId="00000019"/>
+  <w16cid:commentId w16cid:paraId="000002BC" w16cid:durableId="0000001A"/>
+  <w16cid:commentId w16cid:paraId="000002BD" w16cid:durableId="0000001B"/>
+  <w16cid:commentId w16cid:paraId="000002BE" w16cid:durableId="0000001C"/>
+  <w16cid:commentId w16cid:paraId="000002BF" w16cid:durableId="0000001D"/>
+  <w16cid:commentId w16cid:paraId="000002C0" w16cid:durableId="0000001E"/>
+  <w16cid:commentId w16cid:paraId="000002C1" w16cid:durableId="0000001F"/>
+</w16cid:commentsIds>
 </file>
 
 <file path=word/footer1.xml><?xml version="1.0" encoding="utf-8"?>
@@ -23660,6 +24430,11 @@
       <w:szCs w:val="30"/>
     </w:rPr>
   </w:style>
+  <w:style w:type="paragraph" w:styleId="TableofFigures">
+    <w:name w:val="table of figures"/>
+    <w:basedOn w:val="Normal"/>
+    <w:next w:val="Normal"/>
+  </w:style>
   <w:style w:type="table" w:styleId="Table1">
     <w:basedOn w:val="TableNormal"/>
     <w:tblPr>
@@ -23775,6 +24550,32 @@
     </w:tblStylePr>
   </w:style>
 </w:styles>
+</file>
+
+<file path=word/tasks.xml><?xml version="1.0" encoding="utf-8"?>
+<Tasks xmlns:mc="http://schemas.openxmlformats.org/markup-compatibility/2006" xmlns:o="urn:schemas-microsoft-com:office:office" xmlns:r="http://schemas.openxmlformats.org/officeDocument/2006/relationships" xmlns:m="http://schemas.openxmlformats.org/officeDocument/2006/math" xmlns:v="urn:schemas-microsoft-com:vml" xmlns:wp="http://schemas.openxmlformats.org/drawingml/2006/wordprocessingDrawing" xmlns:w10="urn:schemas-microsoft-com:office:word" xmlns:w="http://schemas.openxmlformats.org/wordprocessingml/2006/main" xmlns:wne="http://schemas.microsoft.com/office/word/2006/wordml" xmlns:sl="http://schemas.openxmlformats.org/schemaLibrary/2006/main" xmlns:a="http://schemas.openxmlformats.org/drawingml/2006/main" xmlns:pic="http://schemas.openxmlformats.org/drawingml/2006/picture" xmlns:c="http://schemas.openxmlformats.org/drawingml/2006/chart" xmlns:lc="http://schemas.openxmlformats.org/drawingml/2006/lockedCanvas" xmlns:dgm="http://schemas.openxmlformats.org/drawingml/2006/diagram" xmlns:wps="http://schemas.microsoft.com/office/word/2010/wordprocessingShape" xmlns:wpg="http://schemas.microsoft.com/office/word/2010/wordprocessingGroup" xmlns:w14="http://schemas.microsoft.com/office/word/2010/wordml" xmlns:w15="http://schemas.microsoft.com/office/word/2012/wordml" xmlns:w16="http://schemas.microsoft.com/office/word/2018/wordml" xmlns:w16cex="http://schemas.microsoft.com/office/word/2018/wordml/cex" xmlns:w16cid="http://schemas.microsoft.com/office/word/2016/wordml/cid" xmlns="http://schemas.microsoft.com/office/tasks/2019/documenttasks" xmlns:cr="http://schemas.microsoft.com/office/comments/2020/reactions">
+  <Task id="{a6e54ec5-dcd1-4fd4-8d04-4aee6ea4a52b}">
+    <Anchor>
+      <Comment id="16"/>
+    </Anchor>
+    <History>
+      <Event time="2026-09-18T13:50:03.00" id="{09a17c83-7f76-4f08-baf4-2f17fc9901fa}">
+        <Attribution userId="placeholder@email.com" userName="Ana Zepeda" userProvider="google-docs"/>
+        <Anchor>
+          <Comment id="16"/>
+        </Anchor>
+        <Create/>
+      </Event>
+      <Event time="2026-09-18T13:50:03.00" id="{3b6251c8-c0a0-474f-a555-d19f5bce6dbf}">
+        <Attribution userId="placeholder@email.com" userName="Ana Zepeda" userProvider="google-docs"/>
+        <Anchor>
+          <Comment id="16"/>
+        </Anchor>
+        <Assign userId="mfgallagher@ucdavis.edu" userName="mfgallagher@ucdavis.edu" userProvider="google-docs"/>
+      </Event>
+    </History>
+  </Task>
+</Tasks>
 </file>
 
 <file path=word/theme/theme1.xml><?xml version="1.0" encoding="utf-8"?>

</xml_diff>